<commit_message>
Adding document defining section 1
</commit_message>
<xml_diff>
--- a/AICop.docx
+++ b/AICop.docx
@@ -5,1150 +5,942 @@
     <w:p>
       <w:pPr>
         <w:rPr>
-          <w:b/>
-          <w:bCs/>
-        </w:rPr>
-      </w:pPr>
+          <w:rFonts w:ascii="Cambria" w:hAnsi="Cambria" w:cs="Times New Roman"/>
+        </w:rPr>
+      </w:pPr>
+      <w:r>
+        <w:rPr>
+          <w:rFonts w:ascii="Cambria" w:hAnsi="Cambria" w:cs="Times New Roman"/>
+        </w:rPr>
+        <w:t>1. Problem Formulation</w:t>
+      </w:r>
+    </w:p>
+    <w:p>
+      <w:pPr>
+        <w:rPr>
+          <w:rFonts w:ascii="Cambria" w:hAnsi="Cambria" w:cs="Times New Roman"/>
+        </w:rPr>
+      </w:pPr>
+      <w:r>
+        <w:rPr>
+          <w:rFonts w:ascii="Cambria" w:hAnsi="Cambria" w:cs="Times New Roman"/>
+        </w:rPr>
+        <w:t>1.1 Application Domain</w:t>
+      </w:r>
+    </w:p>
+    <w:p>
+      <w:pPr>
+        <w:rPr>
+          <w:rFonts w:ascii="Cambria" w:hAnsi="Cambria" w:cs="Times New Roman"/>
+        </w:rPr>
+      </w:pPr>
+      <w:r>
+        <w:rPr>
+          <w:rFonts w:ascii="Cambria" w:hAnsi="Cambria" w:cs="Times New Roman"/>
+        </w:rPr>
+        <w:t>Domain: Artificial Intelligence Security, Reliability, and Trustworthiness Assessment</w:t>
+      </w:r>
+    </w:p>
+    <w:p>
+      <w:pPr>
+        <w:rPr>
+          <w:rFonts w:ascii="Cambria" w:hAnsi="Cambria" w:cs="Times New Roman"/>
+        </w:rPr>
+      </w:pPr>
+      <w:r>
+        <w:rPr>
+          <w:rFonts w:ascii="Cambria" w:hAnsi="Cambria" w:cs="Times New Roman"/>
+        </w:rPr>
+        <w:t>The rapid adoption of Generative Artificial Intelligence (GenAI) and Large Language Models (LLMs) has transformed software applications across domains including healthcare, finance, education, software engineering, and customer support. Despite their widespread adoption, these systems remain vulnerable to several operational and security-related challenges, including prompt injection attacks, jailbreak attempts, prompt leakage, hallucinations, inconsistent reasoning, and unreliable responses.</w:t>
+      </w:r>
+    </w:p>
+    <w:p>
+      <w:pPr>
+        <w:rPr>
+          <w:rFonts w:ascii="Cambria" w:hAnsi="Cambria" w:cs="Times New Roman"/>
+        </w:rPr>
+      </w:pPr>
+      <w:r>
+        <w:rPr>
+          <w:rFonts w:ascii="Cambria" w:hAnsi="Cambria" w:cs="Times New Roman"/>
+        </w:rPr>
+        <w:t>Ensuring that AI systems behave reliably and securely before deployment has therefore become a critical requirement for organizations developing AI-enabled software. Existing evaluation approaches typically focus on individual aspects such as security testing, model evaluation, or performance benchmarking. Consequently, developers are often required to utilize multiple disconnected tools and manually consolidate results, leading to increased complexity and reduced efficiency during AI validation.</w:t>
+      </w:r>
+    </w:p>
+    <w:p>
+      <w:pPr>
+        <w:rPr>
+          <w:rFonts w:ascii="Cambria" w:hAnsi="Cambria" w:cs="Times New Roman"/>
+        </w:rPr>
+      </w:pPr>
+      <w:r>
+        <w:rPr>
+          <w:rFonts w:ascii="Cambria" w:hAnsi="Cambria" w:cs="Times New Roman"/>
+        </w:rPr>
+        <w:pict w14:anchorId="17164E21">
+          <v:rect id="_x0000_i1145" style="width:0;height:1.5pt" o:hralign="center" o:hrstd="t" o:hr="t" fillcolor="#a0a0a0" stroked="f"/>
+        </w:pict>
+      </w:r>
+    </w:p>
+    <w:p>
+      <w:pPr>
+        <w:rPr>
+          <w:rFonts w:ascii="Cambria" w:hAnsi="Cambria" w:cs="Times New Roman"/>
+        </w:rPr>
+      </w:pPr>
+      <w:r>
+        <w:rPr>
+          <w:rFonts w:ascii="Cambria" w:hAnsi="Cambria" w:cs="Times New Roman"/>
+        </w:rPr>
+        <w:t>1.2 Problem Statement</w:t>
+      </w:r>
+    </w:p>
+    <w:p>
+      <w:pPr>
+        <w:rPr>
+          <w:rFonts w:ascii="Cambria" w:hAnsi="Cambria" w:cs="Times New Roman"/>
+        </w:rPr>
+      </w:pPr>
+      <w:r>
+        <w:rPr>
+          <w:rFonts w:ascii="Cambria" w:hAnsi="Cambria" w:cs="Times New Roman"/>
+        </w:rPr>
+        <w:t>Current AI evaluation practices lack a unified framework capable of simultaneously assessing both the security posture and behavioural reliability of AI systems. Security vulnerabilities such as prompt injection and jailbreak attacks, together with reliability issues including hallucinations and inconsistent reasoning, are frequently evaluated independently despite being closely related indicators of overall AI trustworthiness.</w:t>
+      </w:r>
+    </w:p>
+    <w:p>
+      <w:pPr>
+        <w:rPr>
+          <w:rFonts w:ascii="Cambria" w:hAnsi="Cambria" w:cs="Times New Roman"/>
+        </w:rPr>
+      </w:pPr>
+      <w:r>
+        <w:rPr>
+          <w:rFonts w:ascii="Cambria" w:hAnsi="Cambria" w:cs="Times New Roman"/>
+        </w:rPr>
+        <w:t>The absence of an integrated investigation workflow limits the ability of developers to obtain a comprehensive understanding of model behaviour prior to deployment.</w:t>
+      </w:r>
+    </w:p>
+    <w:p>
+      <w:pPr>
+        <w:rPr>
+          <w:rFonts w:ascii="Cambria" w:hAnsi="Cambria" w:cs="Times New Roman"/>
+        </w:rPr>
+      </w:pPr>
+      <w:r>
+        <w:rPr>
+          <w:rFonts w:ascii="Cambria" w:hAnsi="Cambria" w:cs="Times New Roman"/>
+        </w:rPr>
+        <w:t xml:space="preserve">To address this limitation, this project proposes </w:t>
+      </w:r>
       <w:proofErr w:type="spellStart"/>
       <w:r>
         <w:rPr>
-          <w:b/>
-          <w:bCs/>
+          <w:rFonts w:ascii="Cambria" w:hAnsi="Cambria" w:cs="Times New Roman"/>
         </w:rPr>
         <w:t>AICop</w:t>
       </w:r>
       <w:proofErr w:type="spellEnd"/>
       <w:r>
         <w:rPr>
-          <w:b/>
-          <w:bCs/>
-        </w:rPr>
-        <w:t>: A Multi-Agent AI Security and Reliability Investigation Platform</w:t>
-      </w:r>
-    </w:p>
-    <w:p>
-      <w:pPr>
-        <w:rPr>
-          <w:b/>
-          <w:bCs/>
-        </w:rPr>
-      </w:pPr>
-      <w:r>
-        <w:rPr>
-          <w:b/>
-          <w:bCs/>
-        </w:rPr>
-        <w:t>1. Problem Statement</w:t>
-      </w:r>
-    </w:p>
-    <w:p>
-      <w:r>
-        <w:t>The rapid adoption of Large Language Models (LLMs) and Generative AI systems across enterprise, healthcare, finance, education, and software engineering has introduced significant challenges in ensuring their security, reliability, and trustworthiness. Modern AI systems remain vulnerable to prompt injection attacks, jailbreak attempts, prompt leakage, hallucinations, inconsistent reasoning, and unsafe responses. Existing evaluation approaches typically assess these aspects independently, requiring developers to manually combine multiple tools and interpret fragmented results.</w:t>
-      </w:r>
-    </w:p>
-    <w:p>
-      <w:r>
-        <w:t xml:space="preserve">To address this limitation, we propose </w:t>
+          <w:rFonts w:ascii="Cambria" w:hAnsi="Cambria" w:cs="Times New Roman"/>
+        </w:rPr>
+        <w:t xml:space="preserve">, a Multi-Agent AI Investigation Platform designed to automate the end-to-end investigation of AI systems. The platform orchestrates specialized investigation agents to perform adversarial security testing, behavioural reliability analysis, evidence aggregation, and automated report generation. By consolidating these investigations into a single workflow, </w:t>
       </w:r>
       <w:proofErr w:type="spellStart"/>
       <w:r>
         <w:rPr>
-          <w:b/>
-          <w:bCs/>
+          <w:rFonts w:ascii="Cambria" w:hAnsi="Cambria" w:cs="Times New Roman"/>
         </w:rPr>
         <w:t>AICop</w:t>
       </w:r>
       <w:proofErr w:type="spellEnd"/>
       <w:r>
-        <w:t>, a Multi-Agent AI Security and Reliability Investigation Platform that automates the investigation of AI systems through coordinated intelligent agents. The platform performs security assessments, evaluates model reliability, consolidates findings, and generates comprehensive investigation reports with actionable recommendations. The proposed solution provides developers with an integrated framework for validating AI systems prior to deployment.</w:t>
-      </w:r>
-    </w:p>
-    <w:p>
-      <w:r>
-        <w:pict w14:anchorId="15F3A9CC">
-          <v:rect id="_x0000_i1073" style="width:0;height:1.5pt" o:hralign="center" o:hrstd="t" o:hr="t" fillcolor="#a0a0a0" stroked="f"/>
+        <w:rPr>
+          <w:rFonts w:ascii="Cambria" w:hAnsi="Cambria" w:cs="Times New Roman"/>
+        </w:rPr>
+        <w:t xml:space="preserve"> enables developers to identify vulnerabilities, evaluate trustworthiness, and receive actionable recommendations for improving AI system robustness.</w:t>
+      </w:r>
+    </w:p>
+    <w:p>
+      <w:pPr>
+        <w:rPr>
+          <w:rFonts w:ascii="Cambria" w:hAnsi="Cambria" w:cs="Times New Roman"/>
+        </w:rPr>
+      </w:pPr>
+      <w:r>
+        <w:rPr>
+          <w:rFonts w:ascii="Cambria" w:hAnsi="Cambria" w:cs="Times New Roman"/>
+        </w:rPr>
+        <w:pict w14:anchorId="4DC00428">
+          <v:rect id="_x0000_i1146" style="width:0;height:1.5pt" o:hralign="center" o:hrstd="t" o:hr="t" fillcolor="#a0a0a0" stroked="f"/>
         </w:pict>
       </w:r>
     </w:p>
     <w:p>
       <w:pPr>
         <w:rPr>
-          <w:b/>
-          <w:bCs/>
-        </w:rPr>
-      </w:pPr>
-      <w:r>
-        <w:rPr>
-          <w:b/>
-          <w:bCs/>
-        </w:rPr>
-        <w:t>2. Domain</w:t>
-      </w:r>
-    </w:p>
-    <w:p>
-      <w:r>
-        <w:rPr>
-          <w:b/>
-          <w:bCs/>
-        </w:rPr>
-        <w:t>Artificial Intelligence Security Engineering and AI Reliability Assessment</w:t>
-      </w:r>
-    </w:p>
-    <w:p>
-      <w:r>
-        <w:pict w14:anchorId="3FC5ACC2">
-          <v:rect id="_x0000_i1074" style="width:0;height:1.5pt" o:hralign="center" o:hrstd="t" o:hr="t" fillcolor="#a0a0a0" stroked="f"/>
-        </w:pict>
-      </w:r>
-    </w:p>
-    <w:p>
-      <w:pPr>
-        <w:rPr>
-          <w:b/>
-          <w:bCs/>
-        </w:rPr>
-      </w:pPr>
-      <w:r>
-        <w:rPr>
-          <w:b/>
-          <w:bCs/>
-        </w:rPr>
-        <w:t>3. Proposed Solution</w:t>
-      </w:r>
-    </w:p>
-    <w:p>
+          <w:rFonts w:ascii="Cambria" w:hAnsi="Cambria" w:cs="Times New Roman"/>
+        </w:rPr>
+      </w:pPr>
+      <w:r>
+        <w:rPr>
+          <w:rFonts w:ascii="Cambria" w:hAnsi="Cambria" w:cs="Times New Roman"/>
+        </w:rPr>
+        <w:t>2. Requirement Specification using GR4ML</w:t>
+      </w:r>
+    </w:p>
+    <w:p>
+      <w:pPr>
+        <w:rPr>
+          <w:rFonts w:ascii="Cambria" w:hAnsi="Cambria" w:cs="Times New Roman"/>
+        </w:rPr>
+      </w:pPr>
+      <w:r>
+        <w:rPr>
+          <w:rFonts w:ascii="Cambria" w:hAnsi="Cambria" w:cs="Times New Roman"/>
+        </w:rPr>
+        <w:t>2.1 Business Goal</w:t>
+      </w:r>
+    </w:p>
+    <w:p>
+      <w:pPr>
+        <w:rPr>
+          <w:rFonts w:ascii="Cambria" w:hAnsi="Cambria" w:cs="Times New Roman"/>
+        </w:rPr>
+      </w:pPr>
+      <w:r>
+        <w:rPr>
+          <w:rFonts w:ascii="Cambria" w:hAnsi="Cambria" w:cs="Times New Roman"/>
+        </w:rPr>
+        <w:lastRenderedPageBreak/>
+        <w:t xml:space="preserve">The primary business objective of </w:t>
+      </w:r>
       <w:proofErr w:type="spellStart"/>
       <w:r>
+        <w:rPr>
+          <w:rFonts w:ascii="Cambria" w:hAnsi="Cambria" w:cs="Times New Roman"/>
+        </w:rPr>
         <w:t>AICop</w:t>
       </w:r>
       <w:proofErr w:type="spellEnd"/>
       <w:r>
-        <w:t xml:space="preserve"> is a modular multi-agent platform designed to investigate AI systems by simulating adversarial attacks, evaluating behavioural consistency, measuring model reliability, and generating explainable forensic reports. The platform integrates specialized investigation agents under a centralized orchestration layer to automate end-to-end AI assessment.</w:t>
-      </w:r>
-    </w:p>
-    <w:p>
-      <w:r>
-        <w:t xml:space="preserve">Unlike conventional evaluation tools that focus on isolated metrics, </w:t>
-      </w:r>
-      <w:proofErr w:type="spellStart"/>
-      <w:r>
-        <w:t>AICop</w:t>
-      </w:r>
-      <w:proofErr w:type="spellEnd"/>
-      <w:r>
-        <w:t xml:space="preserve"> combines security testing, reliability analysis, and automated reporting within a unified investigation workflow.</w:t>
-      </w:r>
-    </w:p>
-    <w:p>
-      <w:r>
-        <w:pict w14:anchorId="1D816A6A">
-          <v:rect id="_x0000_i1075" style="width:0;height:1.5pt" o:hralign="center" o:hrstd="t" o:hr="t" fillcolor="#a0a0a0" stroked="f"/>
-        </w:pict>
-      </w:r>
-    </w:p>
-    <w:p>
-      <w:pPr>
-        <w:rPr>
-          <w:b/>
-          <w:bCs/>
-        </w:rPr>
-      </w:pPr>
-      <w:r>
-        <w:rPr>
-          <w:b/>
-          <w:bCs/>
-        </w:rPr>
-        <w:t>4. GR4ML Business View</w:t>
-      </w:r>
-    </w:p>
-    <w:p>
-      <w:pPr>
-        <w:rPr>
-          <w:b/>
-          <w:bCs/>
-        </w:rPr>
-      </w:pPr>
-      <w:r>
-        <w:rPr>
-          <w:b/>
-          <w:bCs/>
-        </w:rPr>
-        <w:t>Business Objective</w:t>
-      </w:r>
-    </w:p>
-    <w:p>
-      <w:r>
-        <w:t xml:space="preserve">Develop an intelligent investigation platform that enables AI developers and organizations to systematically evaluate the security, robustness, and reliability of AI </w:t>
-      </w:r>
-      <w:r>
-        <w:lastRenderedPageBreak/>
-        <w:t>systems before deployment, thereby reducing operational risks and improving trust in AI-driven applications.</w:t>
-      </w:r>
-    </w:p>
-    <w:p>
-      <w:pPr>
-        <w:rPr>
-          <w:b/>
-          <w:bCs/>
-        </w:rPr>
-      </w:pPr>
-      <w:r>
-        <w:rPr>
-          <w:b/>
-          <w:bCs/>
-        </w:rPr>
-        <w:t>Stakeholders</w:t>
+        <w:rPr>
+          <w:rFonts w:ascii="Cambria" w:hAnsi="Cambria" w:cs="Times New Roman"/>
+        </w:rPr>
+        <w:t xml:space="preserve"> is to provide developers and organizations with an automated investigation platform capable of evaluating the security, reliability, and trustworthiness of AI systems prior to deployment.</w:t>
+      </w:r>
+    </w:p>
+    <w:p>
+      <w:pPr>
+        <w:rPr>
+          <w:rFonts w:ascii="Cambria" w:hAnsi="Cambria" w:cs="Times New Roman"/>
+        </w:rPr>
+      </w:pPr>
+      <w:r>
+        <w:rPr>
+          <w:rFonts w:ascii="Cambria" w:hAnsi="Cambria" w:cs="Times New Roman"/>
+        </w:rPr>
+        <w:t>The platform aims to reduce the effort required for manual AI validation while improving confidence in production-ready AI applications through comprehensive investigation reports and explainable recommendations.</w:t>
+      </w:r>
+    </w:p>
+    <w:p>
+      <w:pPr>
+        <w:rPr>
+          <w:rFonts w:ascii="Cambria" w:hAnsi="Cambria" w:cs="Times New Roman"/>
+        </w:rPr>
+      </w:pPr>
+      <w:r>
+        <w:rPr>
+          <w:rFonts w:ascii="Cambria" w:hAnsi="Cambria" w:cs="Times New Roman"/>
+        </w:rPr>
+        <w:t>Success Criteria</w:t>
       </w:r>
     </w:p>
     <w:p>
       <w:pPr>
         <w:numPr>
           <w:ilvl w:val="0"/>
-          <w:numId w:val="1"/>
+          <w:numId w:val="11"/>
         </w:numPr>
-      </w:pPr>
-      <w:r>
-        <w:t>AI/ML Engineers</w:t>
+        <w:rPr>
+          <w:rFonts w:ascii="Cambria" w:hAnsi="Cambria" w:cs="Times New Roman"/>
+        </w:rPr>
+      </w:pPr>
+      <w:r>
+        <w:rPr>
+          <w:rFonts w:ascii="Cambria" w:hAnsi="Cambria" w:cs="Times New Roman"/>
+        </w:rPr>
+        <w:t>Automated end-to-end AI investigation workflow.</w:t>
       </w:r>
     </w:p>
     <w:p>
       <w:pPr>
         <w:numPr>
           <w:ilvl w:val="0"/>
-          <w:numId w:val="1"/>
+          <w:numId w:val="11"/>
         </w:numPr>
-      </w:pPr>
-      <w:r>
-        <w:t>AI Application Developers</w:t>
+        <w:rPr>
+          <w:rFonts w:ascii="Cambria" w:hAnsi="Cambria" w:cs="Times New Roman"/>
+        </w:rPr>
+      </w:pPr>
+      <w:r>
+        <w:rPr>
+          <w:rFonts w:ascii="Cambria" w:hAnsi="Cambria" w:cs="Times New Roman"/>
+        </w:rPr>
+        <w:t>Identification of AI security vulnerabilities.</w:t>
       </w:r>
     </w:p>
     <w:p>
       <w:pPr>
         <w:numPr>
           <w:ilvl w:val="0"/>
-          <w:numId w:val="1"/>
+          <w:numId w:val="11"/>
         </w:numPr>
-      </w:pPr>
-      <w:r>
-        <w:t>Security Analysts</w:t>
+        <w:rPr>
+          <w:rFonts w:ascii="Cambria" w:hAnsi="Cambria" w:cs="Times New Roman"/>
+        </w:rPr>
+      </w:pPr>
+      <w:r>
+        <w:rPr>
+          <w:rFonts w:ascii="Cambria" w:hAnsi="Cambria" w:cs="Times New Roman"/>
+        </w:rPr>
+        <w:t>Reliability assessment of AI-generated responses.</w:t>
       </w:r>
     </w:p>
     <w:p>
       <w:pPr>
         <w:numPr>
           <w:ilvl w:val="0"/>
-          <w:numId w:val="1"/>
+          <w:numId w:val="11"/>
         </w:numPr>
-      </w:pPr>
-      <w:r>
-        <w:t>Software Architects</w:t>
+        <w:rPr>
+          <w:rFonts w:ascii="Cambria" w:hAnsi="Cambria" w:cs="Times New Roman"/>
+        </w:rPr>
+      </w:pPr>
+      <w:r>
+        <w:rPr>
+          <w:rFonts w:ascii="Cambria" w:hAnsi="Cambria" w:cs="Times New Roman"/>
+        </w:rPr>
+        <w:t>Explainable investigation reports with actionable recommendations.</w:t>
       </w:r>
     </w:p>
     <w:p>
       <w:pPr>
         <w:numPr>
           <w:ilvl w:val="0"/>
-          <w:numId w:val="1"/>
+          <w:numId w:val="11"/>
         </w:numPr>
-      </w:pPr>
-      <w:r>
-        <w:t>Organizations deploying Generative AI solutions</w:t>
-      </w:r>
-    </w:p>
-    <w:p>
-      <w:pPr>
-        <w:rPr>
-          <w:b/>
-          <w:bCs/>
-        </w:rPr>
-      </w:pPr>
-      <w:r>
-        <w:rPr>
-          <w:b/>
-          <w:bCs/>
-        </w:rPr>
-        <w:t>Business Benefits</w:t>
+        <w:rPr>
+          <w:rFonts w:ascii="Cambria" w:hAnsi="Cambria" w:cs="Times New Roman"/>
+        </w:rPr>
+      </w:pPr>
+      <w:r>
+        <w:rPr>
+          <w:rFonts w:ascii="Cambria" w:hAnsi="Cambria" w:cs="Times New Roman"/>
+        </w:rPr>
+        <w:t>Modular architecture supporting future investigation capabilities.</w:t>
+      </w:r>
+    </w:p>
+    <w:p>
+      <w:pPr>
+        <w:rPr>
+          <w:rFonts w:ascii="Cambria" w:hAnsi="Cambria" w:cs="Times New Roman"/>
+        </w:rPr>
+      </w:pPr>
+      <w:r>
+        <w:rPr>
+          <w:rFonts w:ascii="Cambria" w:hAnsi="Cambria" w:cs="Times New Roman"/>
+        </w:rPr>
+        <w:pict w14:anchorId="5A6C46E6">
+          <v:rect id="_x0000_i1147" style="width:0;height:1.5pt" o:hralign="center" o:hrstd="t" o:hr="t" fillcolor="#a0a0a0" stroked="f"/>
+        </w:pict>
+      </w:r>
+    </w:p>
+    <w:p>
+      <w:pPr>
+        <w:rPr>
+          <w:rFonts w:ascii="Cambria" w:hAnsi="Cambria" w:cs="Times New Roman"/>
+        </w:rPr>
+      </w:pPr>
+      <w:r>
+        <w:rPr>
+          <w:rFonts w:ascii="Cambria" w:hAnsi="Cambria" w:cs="Times New Roman"/>
+        </w:rPr>
+        <w:t>2.2 Analytics Goal</w:t>
+      </w:r>
+    </w:p>
+    <w:p>
+      <w:pPr>
+        <w:rPr>
+          <w:rFonts w:ascii="Cambria" w:hAnsi="Cambria" w:cs="Times New Roman"/>
+        </w:rPr>
+      </w:pPr>
+      <w:r>
+        <w:rPr>
+          <w:rFonts w:ascii="Cambria" w:hAnsi="Cambria" w:cs="Times New Roman"/>
+        </w:rPr>
+        <w:t>The analytical objective is to employ a collaborative multi-agent framework that autonomously investigates AI systems by identifying security vulnerabilities, analysing behavioural reliability, evaluating investigation evidence, and generating comprehensive risk assessments.</w:t>
+      </w:r>
+    </w:p>
+    <w:p>
+      <w:pPr>
+        <w:rPr>
+          <w:rFonts w:ascii="Cambria" w:hAnsi="Cambria" w:cs="Times New Roman"/>
+        </w:rPr>
+      </w:pPr>
+      <w:r>
+        <w:rPr>
+          <w:rFonts w:ascii="Cambria" w:hAnsi="Cambria" w:cs="Times New Roman"/>
+        </w:rPr>
+        <w:t>The analytical pipeline consists of specialized investigation agents responsible for:</w:t>
       </w:r>
     </w:p>
     <w:p>
       <w:pPr>
         <w:numPr>
           <w:ilvl w:val="0"/>
-          <w:numId w:val="2"/>
+          <w:numId w:val="12"/>
         </w:numPr>
-      </w:pPr>
-      <w:r>
-        <w:t>Early detection of AI vulnerabilities.</w:t>
+        <w:rPr>
+          <w:rFonts w:ascii="Cambria" w:hAnsi="Cambria" w:cs="Times New Roman"/>
+        </w:rPr>
+      </w:pPr>
+      <w:r>
+        <w:rPr>
+          <w:rFonts w:ascii="Cambria" w:hAnsi="Cambria" w:cs="Times New Roman"/>
+        </w:rPr>
+        <w:t>Prompt Injection Detection</w:t>
       </w:r>
     </w:p>
     <w:p>
       <w:pPr>
         <w:numPr>
           <w:ilvl w:val="0"/>
-          <w:numId w:val="2"/>
+          <w:numId w:val="12"/>
         </w:numPr>
-      </w:pPr>
-      <w:r>
-        <w:t>Improved trustworthiness of deployed AI systems.</w:t>
+        <w:rPr>
+          <w:rFonts w:ascii="Cambria" w:hAnsi="Cambria" w:cs="Times New Roman"/>
+        </w:rPr>
+      </w:pPr>
+      <w:r>
+        <w:rPr>
+          <w:rFonts w:ascii="Cambria" w:hAnsi="Cambria" w:cs="Times New Roman"/>
+        </w:rPr>
+        <w:t>Jailbreak Detection</w:t>
       </w:r>
     </w:p>
     <w:p>
       <w:pPr>
         <w:numPr>
           <w:ilvl w:val="0"/>
-          <w:numId w:val="2"/>
+          <w:numId w:val="12"/>
         </w:numPr>
-      </w:pPr>
-      <w:r>
-        <w:t>Reduced manual effort during AI evaluation.</w:t>
+        <w:rPr>
+          <w:rFonts w:ascii="Cambria" w:hAnsi="Cambria" w:cs="Times New Roman"/>
+        </w:rPr>
+      </w:pPr>
+      <w:r>
+        <w:rPr>
+          <w:rFonts w:ascii="Cambria" w:hAnsi="Cambria" w:cs="Times New Roman"/>
+        </w:rPr>
+        <w:t>Prompt Leakage Analysis</w:t>
       </w:r>
     </w:p>
     <w:p>
       <w:pPr>
         <w:numPr>
           <w:ilvl w:val="0"/>
-          <w:numId w:val="2"/>
+          <w:numId w:val="12"/>
         </w:numPr>
-      </w:pPr>
-      <w:r>
-        <w:t>Standardized AI investigation workflow.</w:t>
+        <w:rPr>
+          <w:rFonts w:ascii="Cambria" w:hAnsi="Cambria" w:cs="Times New Roman"/>
+        </w:rPr>
+      </w:pPr>
+      <w:r>
+        <w:rPr>
+          <w:rFonts w:ascii="Cambria" w:hAnsi="Cambria" w:cs="Times New Roman"/>
+        </w:rPr>
+        <w:t>Hallucination Detection</w:t>
       </w:r>
     </w:p>
     <w:p>
       <w:pPr>
         <w:numPr>
           <w:ilvl w:val="0"/>
-          <w:numId w:val="2"/>
+          <w:numId w:val="12"/>
         </w:numPr>
-      </w:pPr>
-      <w:r>
-        <w:t>Explainable security and reliability assessments.</w:t>
-      </w:r>
-    </w:p>
-    <w:p>
-      <w:pPr>
-        <w:rPr>
-          <w:b/>
-          <w:bCs/>
-        </w:rPr>
-      </w:pPr>
-      <w:r>
-        <w:rPr>
-          <w:b/>
-          <w:bCs/>
-        </w:rPr>
-        <w:t>Success Criteria</w:t>
+        <w:rPr>
+          <w:rFonts w:ascii="Cambria" w:hAnsi="Cambria" w:cs="Times New Roman"/>
+        </w:rPr>
+      </w:pPr>
+      <w:r>
+        <w:rPr>
+          <w:rFonts w:ascii="Cambria" w:hAnsi="Cambria" w:cs="Times New Roman"/>
+        </w:rPr>
+        <w:t>Behavioural Consistency Evaluation</w:t>
       </w:r>
     </w:p>
     <w:p>
       <w:pPr>
         <w:numPr>
           <w:ilvl w:val="0"/>
-          <w:numId w:val="3"/>
+          <w:numId w:val="12"/>
         </w:numPr>
-      </w:pPr>
-      <w:r>
-        <w:t>Automated investigation pipeline.</w:t>
+        <w:rPr>
+          <w:rFonts w:ascii="Cambria" w:hAnsi="Cambria" w:cs="Times New Roman"/>
+        </w:rPr>
+      </w:pPr>
+      <w:r>
+        <w:rPr>
+          <w:rFonts w:ascii="Cambria" w:hAnsi="Cambria" w:cs="Times New Roman"/>
+        </w:rPr>
+        <w:t>Reliability Scoring</w:t>
       </w:r>
     </w:p>
     <w:p>
       <w:pPr>
         <w:numPr>
           <w:ilvl w:val="0"/>
-          <w:numId w:val="3"/>
+          <w:numId w:val="12"/>
         </w:numPr>
-      </w:pPr>
-      <w:r>
-        <w:t>Comprehensive investigation report generation.</w:t>
+        <w:rPr>
+          <w:rFonts w:ascii="Cambria" w:hAnsi="Cambria" w:cs="Times New Roman"/>
+        </w:rPr>
+      </w:pPr>
+      <w:r>
+        <w:rPr>
+          <w:rFonts w:ascii="Cambria" w:hAnsi="Cambria" w:cs="Times New Roman"/>
+        </w:rPr>
+        <w:t>Risk Classification</w:t>
       </w:r>
     </w:p>
     <w:p>
       <w:pPr>
         <w:numPr>
           <w:ilvl w:val="0"/>
-          <w:numId w:val="3"/>
+          <w:numId w:val="12"/>
         </w:numPr>
-      </w:pPr>
-      <w:r>
-        <w:t>Modular architecture supporting future investigation agents.</w:t>
+        <w:rPr>
+          <w:rFonts w:ascii="Cambria" w:hAnsi="Cambria" w:cs="Times New Roman"/>
+        </w:rPr>
+      </w:pPr>
+      <w:r>
+        <w:rPr>
+          <w:rFonts w:ascii="Cambria" w:hAnsi="Cambria" w:cs="Times New Roman"/>
+        </w:rPr>
+        <w:t>Recommendation Generation</w:t>
+      </w:r>
+    </w:p>
+    <w:p>
+      <w:pPr>
+        <w:rPr>
+          <w:rFonts w:ascii="Cambria" w:hAnsi="Cambria" w:cs="Times New Roman"/>
+        </w:rPr>
+      </w:pPr>
+      <w:r>
+        <w:rPr>
+          <w:rFonts w:ascii="Cambria" w:hAnsi="Cambria" w:cs="Times New Roman"/>
+        </w:rPr>
+        <w:t>The combined analytical outputs provide a holistic assessment of AI trustworthiness.</w:t>
+      </w:r>
+    </w:p>
+    <w:p>
+      <w:pPr>
+        <w:rPr>
+          <w:rFonts w:ascii="Cambria" w:hAnsi="Cambria" w:cs="Times New Roman"/>
+        </w:rPr>
+      </w:pPr>
+      <w:r>
+        <w:rPr>
+          <w:rFonts w:ascii="Cambria" w:hAnsi="Cambria" w:cs="Times New Roman"/>
+        </w:rPr>
+        <w:pict w14:anchorId="06E8D3A1">
+          <v:rect id="_x0000_i1148" style="width:0;height:1.5pt" o:hralign="center" o:hrstd="t" o:hr="t" fillcolor="#a0a0a0" stroked="f"/>
+        </w:pict>
+      </w:r>
+    </w:p>
+    <w:p>
+      <w:pPr>
+        <w:rPr>
+          <w:rFonts w:ascii="Cambria" w:hAnsi="Cambria" w:cs="Times New Roman"/>
+        </w:rPr>
+      </w:pPr>
+      <w:r>
+        <w:rPr>
+          <w:rFonts w:ascii="Cambria" w:hAnsi="Cambria" w:cs="Times New Roman"/>
+        </w:rPr>
+        <w:t>2.3 Data Goal</w:t>
+      </w:r>
+    </w:p>
+    <w:p>
+      <w:pPr>
+        <w:rPr>
+          <w:rFonts w:ascii="Cambria" w:hAnsi="Cambria" w:cs="Times New Roman"/>
+        </w:rPr>
+      </w:pPr>
+      <w:r>
+        <w:rPr>
+          <w:rFonts w:ascii="Cambria" w:hAnsi="Cambria" w:cs="Times New Roman"/>
+        </w:rPr>
+        <w:lastRenderedPageBreak/>
+        <w:t>The objective of the data preparation process is to collect, validate, transform, and organize AI interaction data required for automated investigation.</w:t>
+      </w:r>
+    </w:p>
+    <w:p>
+      <w:pPr>
+        <w:rPr>
+          <w:rFonts w:ascii="Cambria" w:hAnsi="Cambria" w:cs="Times New Roman"/>
+        </w:rPr>
+      </w:pPr>
+      <w:r>
+        <w:rPr>
+          <w:rFonts w:ascii="Cambria" w:hAnsi="Cambria" w:cs="Times New Roman"/>
+        </w:rPr>
+        <w:t>Input Data</w:t>
       </w:r>
     </w:p>
     <w:p>
       <w:pPr>
         <w:numPr>
           <w:ilvl w:val="0"/>
-          <w:numId w:val="3"/>
+          <w:numId w:val="13"/>
         </w:numPr>
-      </w:pPr>
-      <w:r>
-        <w:t>Improved AI deployment confidence through actionable recommendations.</w:t>
-      </w:r>
-    </w:p>
-    <w:p>
-      <w:r>
-        <w:pict w14:anchorId="08DC397B">
-          <v:rect id="_x0000_i1076" style="width:0;height:1.5pt" o:hralign="center" o:hrstd="t" o:hr="t" fillcolor="#a0a0a0" stroked="f"/>
-        </w:pict>
-      </w:r>
-    </w:p>
-    <w:p>
-      <w:pPr>
-        <w:rPr>
-          <w:b/>
-          <w:bCs/>
-        </w:rPr>
-      </w:pPr>
-      <w:r>
-        <w:rPr>
-          <w:b/>
-          <w:bCs/>
-        </w:rPr>
-        <w:t>5. GR4ML Analytics Design View</w:t>
-      </w:r>
-    </w:p>
-    <w:p>
-      <w:pPr>
-        <w:rPr>
-          <w:b/>
-          <w:bCs/>
-        </w:rPr>
-      </w:pPr>
-      <w:r>
-        <w:rPr>
-          <w:b/>
-          <w:bCs/>
-        </w:rPr>
-        <w:t>Analytics Objective</w:t>
-      </w:r>
-    </w:p>
-    <w:p>
-      <w:r>
-        <w:t>Automatically investigate AI systems using specialized intelligent agents capable of identifying security vulnerabilities, evaluating reliability characteristics, and producing explainable recommendations through collaborative reasoning.</w:t>
-      </w:r>
-    </w:p>
-    <w:p>
-      <w:pPr>
-        <w:rPr>
-          <w:b/>
-          <w:bCs/>
-        </w:rPr>
-      </w:pPr>
-      <w:r>
-        <w:rPr>
-          <w:b/>
-          <w:bCs/>
-        </w:rPr>
-        <w:t>Analytical Tasks</w:t>
+        <w:rPr>
+          <w:rFonts w:ascii="Cambria" w:hAnsi="Cambria" w:cs="Times New Roman"/>
+        </w:rPr>
+      </w:pPr>
+      <w:r>
+        <w:rPr>
+          <w:rFonts w:ascii="Cambria" w:hAnsi="Cambria" w:cs="Times New Roman"/>
+        </w:rPr>
+        <w:t>User Prompt</w:t>
       </w:r>
     </w:p>
     <w:p>
       <w:pPr>
         <w:numPr>
           <w:ilvl w:val="0"/>
-          <w:numId w:val="4"/>
+          <w:numId w:val="13"/>
         </w:numPr>
-      </w:pPr>
-      <w:r>
-        <w:t>Prompt Injection Detection</w:t>
+        <w:rPr>
+          <w:rFonts w:ascii="Cambria" w:hAnsi="Cambria" w:cs="Times New Roman"/>
+        </w:rPr>
+      </w:pPr>
+      <w:r>
+        <w:rPr>
+          <w:rFonts w:ascii="Cambria" w:hAnsi="Cambria" w:cs="Times New Roman"/>
+        </w:rPr>
+        <w:t>AI Generated Response</w:t>
       </w:r>
     </w:p>
     <w:p>
       <w:pPr>
         <w:numPr>
           <w:ilvl w:val="0"/>
-          <w:numId w:val="4"/>
+          <w:numId w:val="13"/>
         </w:numPr>
-      </w:pPr>
-      <w:r>
-        <w:t>Jailbreak Detection</w:t>
+        <w:rPr>
+          <w:rFonts w:ascii="Cambria" w:hAnsi="Cambria" w:cs="Times New Roman"/>
+        </w:rPr>
+      </w:pPr>
+      <w:r>
+        <w:rPr>
+          <w:rFonts w:ascii="Cambria" w:hAnsi="Cambria" w:cs="Times New Roman"/>
+        </w:rPr>
+        <w:t>Conversation Context</w:t>
       </w:r>
     </w:p>
     <w:p>
       <w:pPr>
         <w:numPr>
           <w:ilvl w:val="0"/>
-          <w:numId w:val="4"/>
+          <w:numId w:val="13"/>
         </w:numPr>
-      </w:pPr>
-      <w:r>
-        <w:t>Prompt Leakage Analysis</w:t>
+        <w:rPr>
+          <w:rFonts w:ascii="Cambria" w:hAnsi="Cambria" w:cs="Times New Roman"/>
+        </w:rPr>
+      </w:pPr>
+      <w:r>
+        <w:rPr>
+          <w:rFonts w:ascii="Cambria" w:hAnsi="Cambria" w:cs="Times New Roman"/>
+        </w:rPr>
+        <w:t>Investigation Configuration</w:t>
       </w:r>
     </w:p>
     <w:p>
       <w:pPr>
         <w:numPr>
           <w:ilvl w:val="0"/>
-          <w:numId w:val="4"/>
+          <w:numId w:val="13"/>
         </w:numPr>
-      </w:pPr>
-      <w:r>
-        <w:lastRenderedPageBreak/>
-        <w:t>Hallucination Assessment</w:t>
+        <w:rPr>
+          <w:rFonts w:ascii="Cambria" w:hAnsi="Cambria" w:cs="Times New Roman"/>
+        </w:rPr>
+      </w:pPr>
+      <w:r>
+        <w:rPr>
+          <w:rFonts w:ascii="Cambria" w:hAnsi="Cambria" w:cs="Times New Roman"/>
+        </w:rPr>
+        <w:t>Model Metadata (Optional)</w:t>
+      </w:r>
+    </w:p>
+    <w:p>
+      <w:pPr>
+        <w:rPr>
+          <w:rFonts w:ascii="Cambria" w:hAnsi="Cambria" w:cs="Times New Roman"/>
+        </w:rPr>
+      </w:pPr>
+      <w:r>
+        <w:rPr>
+          <w:rFonts w:ascii="Cambria" w:hAnsi="Cambria" w:cs="Times New Roman"/>
+        </w:rPr>
+        <w:t>Data Preparation Activities</w:t>
       </w:r>
     </w:p>
     <w:p>
       <w:pPr>
         <w:numPr>
           <w:ilvl w:val="0"/>
-          <w:numId w:val="4"/>
+          <w:numId w:val="14"/>
         </w:numPr>
-      </w:pPr>
-      <w:r>
-        <w:t>Output Consistency Evaluation</w:t>
+        <w:rPr>
+          <w:rFonts w:ascii="Cambria" w:hAnsi="Cambria" w:cs="Times New Roman"/>
+        </w:rPr>
+      </w:pPr>
+      <w:r>
+        <w:rPr>
+          <w:rFonts w:ascii="Cambria" w:hAnsi="Cambria" w:cs="Times New Roman"/>
+        </w:rPr>
+        <w:t>Input Validation</w:t>
       </w:r>
     </w:p>
     <w:p>
       <w:pPr>
         <w:numPr>
           <w:ilvl w:val="0"/>
-          <w:numId w:val="4"/>
+          <w:numId w:val="14"/>
         </w:numPr>
-      </w:pPr>
-      <w:r>
-        <w:t>Reliability Scoring</w:t>
+        <w:rPr>
+          <w:rFonts w:ascii="Cambria" w:hAnsi="Cambria" w:cs="Times New Roman"/>
+        </w:rPr>
+      </w:pPr>
+      <w:r>
+        <w:rPr>
+          <w:rFonts w:ascii="Cambria" w:hAnsi="Cambria" w:cs="Times New Roman"/>
+        </w:rPr>
+        <w:t>Prompt Normalization</w:t>
       </w:r>
     </w:p>
     <w:p>
       <w:pPr>
         <w:numPr>
           <w:ilvl w:val="0"/>
-          <w:numId w:val="4"/>
+          <w:numId w:val="14"/>
         </w:numPr>
-      </w:pPr>
-      <w:r>
-        <w:t>Risk Classification</w:t>
+        <w:rPr>
+          <w:rFonts w:ascii="Cambria" w:hAnsi="Cambria" w:cs="Times New Roman"/>
+        </w:rPr>
+      </w:pPr>
+      <w:r>
+        <w:rPr>
+          <w:rFonts w:ascii="Cambria" w:hAnsi="Cambria" w:cs="Times New Roman"/>
+        </w:rPr>
+        <w:t>Conversation Structuring</w:t>
       </w:r>
     </w:p>
     <w:p>
       <w:pPr>
         <w:numPr>
           <w:ilvl w:val="0"/>
-          <w:numId w:val="4"/>
+          <w:numId w:val="14"/>
         </w:numPr>
-      </w:pPr>
-      <w:r>
-        <w:t>Recommendation Generation</w:t>
-      </w:r>
-    </w:p>
-    <w:p>
-      <w:pPr>
-        <w:rPr>
-          <w:b/>
-          <w:bCs/>
-        </w:rPr>
-      </w:pPr>
-      <w:r>
-        <w:rPr>
-          <w:b/>
-          <w:bCs/>
-        </w:rPr>
-        <w:t>AI Components</w:t>
+        <w:rPr>
+          <w:rFonts w:ascii="Cambria" w:hAnsi="Cambria" w:cs="Times New Roman"/>
+        </w:rPr>
+      </w:pPr>
+      <w:r>
+        <w:rPr>
+          <w:rFonts w:ascii="Cambria" w:hAnsi="Cambria" w:cs="Times New Roman"/>
+        </w:rPr>
+        <w:t>Metadata Extraction</w:t>
       </w:r>
     </w:p>
     <w:p>
       <w:pPr>
         <w:numPr>
           <w:ilvl w:val="0"/>
-          <w:numId w:val="5"/>
+          <w:numId w:val="14"/>
         </w:numPr>
-      </w:pPr>
-      <w:r>
-        <w:t>Planner Agent</w:t>
+        <w:rPr>
+          <w:rFonts w:ascii="Cambria" w:hAnsi="Cambria" w:cs="Times New Roman"/>
+        </w:rPr>
+      </w:pPr>
+      <w:r>
+        <w:rPr>
+          <w:rFonts w:ascii="Cambria" w:hAnsi="Cambria" w:cs="Times New Roman"/>
+        </w:rPr>
+        <w:t>Investigation Routing</w:t>
       </w:r>
     </w:p>
     <w:p>
       <w:pPr>
         <w:numPr>
           <w:ilvl w:val="0"/>
-          <w:numId w:val="5"/>
+          <w:numId w:val="14"/>
         </w:numPr>
-      </w:pPr>
-      <w:r>
-        <w:t>Security Investigation Agent</w:t>
+        <w:rPr>
+          <w:rFonts w:ascii="Cambria" w:hAnsi="Cambria" w:cs="Times New Roman"/>
+        </w:rPr>
+      </w:pPr>
+      <w:r>
+        <w:rPr>
+          <w:rFonts w:ascii="Cambria" w:hAnsi="Cambria" w:cs="Times New Roman"/>
+        </w:rPr>
+        <w:t>Evidence Aggregation</w:t>
+      </w:r>
+    </w:p>
+    <w:p>
+      <w:pPr>
+        <w:rPr>
+          <w:rFonts w:ascii="Cambria" w:hAnsi="Cambria" w:cs="Times New Roman"/>
+        </w:rPr>
+      </w:pPr>
+      <w:r>
+        <w:rPr>
+          <w:rFonts w:ascii="Cambria" w:hAnsi="Cambria" w:cs="Times New Roman"/>
+        </w:rPr>
+        <w:t>Output Data</w:t>
       </w:r>
     </w:p>
     <w:p>
       <w:pPr>
         <w:numPr>
           <w:ilvl w:val="0"/>
-          <w:numId w:val="5"/>
+          <w:numId w:val="15"/>
         </w:numPr>
-      </w:pPr>
-      <w:r>
-        <w:t>Reliability Investigation Agent</w:t>
+        <w:rPr>
+          <w:rFonts w:ascii="Cambria" w:hAnsi="Cambria" w:cs="Times New Roman"/>
+        </w:rPr>
+      </w:pPr>
+      <w:r>
+        <w:rPr>
+          <w:rFonts w:ascii="Cambria" w:hAnsi="Cambria" w:cs="Times New Roman"/>
+        </w:rPr>
+        <w:t>Structured Investigation Evidence</w:t>
       </w:r>
     </w:p>
     <w:p>
       <w:pPr>
         <w:numPr>
           <w:ilvl w:val="0"/>
-          <w:numId w:val="5"/>
+          <w:numId w:val="15"/>
         </w:numPr>
-      </w:pPr>
-      <w:r>
-        <w:t>Evaluation Agent</w:t>
+        <w:rPr>
+          <w:rFonts w:ascii="Cambria" w:hAnsi="Cambria" w:cs="Times New Roman"/>
+        </w:rPr>
+      </w:pPr>
+      <w:r>
+        <w:rPr>
+          <w:rFonts w:ascii="Cambria" w:hAnsi="Cambria" w:cs="Times New Roman"/>
+        </w:rPr>
+        <w:t>Security Findings</w:t>
       </w:r>
     </w:p>
     <w:p>
       <w:pPr>
         <w:numPr>
           <w:ilvl w:val="0"/>
-          <w:numId w:val="5"/>
+          <w:numId w:val="15"/>
         </w:numPr>
-      </w:pPr>
-      <w:r>
-        <w:t>Report Generation Agent</w:t>
-      </w:r>
-    </w:p>
-    <w:p>
-      <w:pPr>
-        <w:rPr>
-          <w:b/>
-          <w:bCs/>
-        </w:rPr>
-      </w:pPr>
-      <w:r>
-        <w:rPr>
-          <w:b/>
-          <w:bCs/>
-        </w:rPr>
-        <w:t>Expected Outputs</w:t>
+        <w:rPr>
+          <w:rFonts w:ascii="Cambria" w:hAnsi="Cambria" w:cs="Times New Roman"/>
+        </w:rPr>
+      </w:pPr>
+      <w:r>
+        <w:rPr>
+          <w:rFonts w:ascii="Cambria" w:hAnsi="Cambria" w:cs="Times New Roman"/>
+        </w:rPr>
+        <w:t>Reliability Findings</w:t>
       </w:r>
     </w:p>
     <w:p>
       <w:pPr>
         <w:numPr>
           <w:ilvl w:val="0"/>
-          <w:numId w:val="6"/>
+          <w:numId w:val="15"/>
         </w:numPr>
-      </w:pPr>
-      <w:r>
-        <w:t>Security Risk Score</w:t>
+        <w:rPr>
+          <w:rFonts w:ascii="Cambria" w:hAnsi="Cambria" w:cs="Times New Roman"/>
+        </w:rPr>
+      </w:pPr>
+      <w:r>
+        <w:rPr>
+          <w:rFonts w:ascii="Cambria" w:hAnsi="Cambria" w:cs="Times New Roman"/>
+        </w:rPr>
+        <w:t>Risk Scores</w:t>
       </w:r>
     </w:p>
     <w:p>
       <w:pPr>
         <w:numPr>
           <w:ilvl w:val="0"/>
-          <w:numId w:val="6"/>
+          <w:numId w:val="15"/>
         </w:numPr>
-      </w:pPr>
-      <w:r>
-        <w:t>Reliability Score</w:t>
+        <w:rPr>
+          <w:rFonts w:ascii="Cambria" w:hAnsi="Cambria" w:cs="Times New Roman"/>
+        </w:rPr>
+      </w:pPr>
+      <w:r>
+        <w:rPr>
+          <w:rFonts w:ascii="Cambria" w:hAnsi="Cambria" w:cs="Times New Roman"/>
+        </w:rPr>
+        <w:t>Investigation Report</w:t>
       </w:r>
     </w:p>
     <w:p>
       <w:pPr>
         <w:numPr>
           <w:ilvl w:val="0"/>
-          <w:numId w:val="6"/>
+          <w:numId w:val="15"/>
         </w:numPr>
-      </w:pPr>
-      <w:r>
-        <w:t>Identified Vulnerabilities</w:t>
-      </w:r>
-    </w:p>
-    <w:p>
-      <w:pPr>
-        <w:numPr>
-          <w:ilvl w:val="0"/>
-          <w:numId w:val="6"/>
-        </w:numPr>
-      </w:pPr>
-      <w:r>
-        <w:t>Evidence Log</w:t>
-      </w:r>
-    </w:p>
-    <w:p>
-      <w:pPr>
-        <w:numPr>
-          <w:ilvl w:val="0"/>
-          <w:numId w:val="6"/>
-        </w:numPr>
-      </w:pPr>
-      <w:r>
-        <w:t>Explainable Recommendations</w:t>
-      </w:r>
-    </w:p>
-    <w:p>
-      <w:pPr>
-        <w:numPr>
-          <w:ilvl w:val="0"/>
-          <w:numId w:val="6"/>
-        </w:numPr>
-      </w:pPr>
-      <w:r>
-        <w:t>Investigation Report</w:t>
-      </w:r>
-    </w:p>
-    <w:p>
-      <w:r>
-        <w:pict w14:anchorId="0395D66A">
-          <v:rect id="_x0000_i1077" style="width:0;height:1.5pt" o:hralign="center" o:hrstd="t" o:hr="t" fillcolor="#a0a0a0" stroked="f"/>
+        <w:rPr>
+          <w:rFonts w:ascii="Cambria" w:hAnsi="Cambria" w:cs="Times New Roman"/>
+        </w:rPr>
+      </w:pPr>
+      <w:r>
+        <w:rPr>
+          <w:rFonts w:ascii="Cambria" w:hAnsi="Cambria" w:cs="Times New Roman"/>
+        </w:rPr>
+        <w:t>Mitigation Recommendations</w:t>
+      </w:r>
+    </w:p>
+    <w:p>
+      <w:pPr>
+        <w:rPr>
+          <w:rFonts w:ascii="Cambria" w:hAnsi="Cambria" w:cs="Times New Roman"/>
+        </w:rPr>
+      </w:pPr>
+      <w:r>
+        <w:rPr>
+          <w:rFonts w:ascii="Cambria" w:hAnsi="Cambria" w:cs="Times New Roman"/>
+        </w:rPr>
+        <w:pict w14:anchorId="2D0B7472">
+          <v:rect id="_x0000_i1149" style="width:0;height:1.5pt" o:hralign="center" o:hrstd="t" o:hr="t" fillcolor="#a0a0a0" stroked="f"/>
         </w:pict>
       </w:r>
     </w:p>
     <w:p>
       <w:pPr>
         <w:rPr>
-          <w:b/>
-          <w:bCs/>
-        </w:rPr>
-      </w:pPr>
-      <w:r>
-        <w:rPr>
-          <w:b/>
-          <w:bCs/>
-        </w:rPr>
-        <w:t>6. GR4ML Data Preparation View</w:t>
-      </w:r>
-    </w:p>
-    <w:p>
-      <w:pPr>
-        <w:rPr>
-          <w:b/>
-          <w:bCs/>
-        </w:rPr>
-      </w:pPr>
-      <w:r>
-        <w:rPr>
-          <w:b/>
-          <w:bCs/>
-        </w:rPr>
-        <w:t>Input Sources</w:t>
-      </w:r>
-    </w:p>
-    <w:p>
-      <w:pPr>
-        <w:numPr>
-          <w:ilvl w:val="0"/>
-          <w:numId w:val="7"/>
-        </w:numPr>
-      </w:pPr>
-      <w:r>
-        <w:t>User Prompts</w:t>
-      </w:r>
-    </w:p>
-    <w:p>
-      <w:pPr>
-        <w:numPr>
-          <w:ilvl w:val="0"/>
-          <w:numId w:val="7"/>
-        </w:numPr>
-      </w:pPr>
-      <w:r>
-        <w:t>AI Responses</w:t>
-      </w:r>
-    </w:p>
-    <w:p>
-      <w:pPr>
-        <w:numPr>
-          <w:ilvl w:val="0"/>
-          <w:numId w:val="7"/>
-        </w:numPr>
-      </w:pPr>
-      <w:r>
-        <w:t>Conversation History</w:t>
-      </w:r>
-    </w:p>
-    <w:p>
-      <w:pPr>
-        <w:numPr>
-          <w:ilvl w:val="0"/>
-          <w:numId w:val="7"/>
-        </w:numPr>
-      </w:pPr>
-      <w:r>
-        <w:t>Model Configuration (Optional)</w:t>
-      </w:r>
-    </w:p>
-    <w:p>
-      <w:pPr>
-        <w:numPr>
-          <w:ilvl w:val="0"/>
-          <w:numId w:val="7"/>
-        </w:numPr>
-      </w:pPr>
-      <w:r>
-        <w:t>Evaluation Parameters</w:t>
-      </w:r>
-    </w:p>
-    <w:p>
-      <w:pPr>
-        <w:rPr>
-          <w:b/>
-          <w:bCs/>
-        </w:rPr>
-      </w:pPr>
-      <w:r>
-        <w:rPr>
-          <w:b/>
-          <w:bCs/>
-        </w:rPr>
-        <w:t>Data Preparation Pipeline</w:t>
-      </w:r>
-    </w:p>
-    <w:p>
-      <w:pPr>
-        <w:numPr>
-          <w:ilvl w:val="0"/>
-          <w:numId w:val="8"/>
-        </w:numPr>
-      </w:pPr>
-      <w:r>
-        <w:t>Input Validation</w:t>
-      </w:r>
-    </w:p>
-    <w:p>
-      <w:pPr>
-        <w:numPr>
-          <w:ilvl w:val="0"/>
-          <w:numId w:val="8"/>
-        </w:numPr>
-      </w:pPr>
-      <w:r>
-        <w:lastRenderedPageBreak/>
-        <w:t>Data Cleaning</w:t>
-      </w:r>
-    </w:p>
-    <w:p>
-      <w:pPr>
-        <w:numPr>
-          <w:ilvl w:val="0"/>
-          <w:numId w:val="8"/>
-        </w:numPr>
-      </w:pPr>
-      <w:r>
-        <w:t>Prompt Normalization</w:t>
-      </w:r>
-    </w:p>
-    <w:p>
-      <w:pPr>
-        <w:numPr>
-          <w:ilvl w:val="0"/>
-          <w:numId w:val="8"/>
-        </w:numPr>
-      </w:pPr>
-      <w:r>
-        <w:t>Metadata Extraction</w:t>
-      </w:r>
-    </w:p>
-    <w:p>
-      <w:pPr>
-        <w:numPr>
-          <w:ilvl w:val="0"/>
-          <w:numId w:val="8"/>
-        </w:numPr>
-      </w:pPr>
-      <w:r>
-        <w:t>Investigation Routing</w:t>
-      </w:r>
-    </w:p>
-    <w:p>
-      <w:pPr>
-        <w:numPr>
-          <w:ilvl w:val="0"/>
-          <w:numId w:val="8"/>
-        </w:numPr>
-      </w:pPr>
-      <w:r>
-        <w:t>Agent Processing</w:t>
-      </w:r>
-    </w:p>
-    <w:p>
-      <w:pPr>
-        <w:numPr>
-          <w:ilvl w:val="0"/>
-          <w:numId w:val="8"/>
-        </w:numPr>
-      </w:pPr>
-      <w:r>
-        <w:t>Evidence Aggregation</w:t>
-      </w:r>
-    </w:p>
-    <w:p>
-      <w:pPr>
-        <w:numPr>
-          <w:ilvl w:val="0"/>
-          <w:numId w:val="8"/>
-        </w:numPr>
-      </w:pPr>
-      <w:r>
-        <w:t>Report Generation</w:t>
-      </w:r>
-    </w:p>
-    <w:p>
-      <w:pPr>
-        <w:rPr>
-          <w:b/>
-          <w:bCs/>
-        </w:rPr>
-      </w:pPr>
-      <w:r>
-        <w:rPr>
-          <w:b/>
-          <w:bCs/>
-        </w:rPr>
-        <w:t>Output Artefacts</w:t>
-      </w:r>
-    </w:p>
-    <w:p>
-      <w:pPr>
-        <w:numPr>
-          <w:ilvl w:val="0"/>
-          <w:numId w:val="9"/>
-        </w:numPr>
-      </w:pPr>
-      <w:r>
-        <w:t>Structured Investigation Results</w:t>
-      </w:r>
-    </w:p>
-    <w:p>
-      <w:pPr>
-        <w:numPr>
-          <w:ilvl w:val="0"/>
-          <w:numId w:val="9"/>
-        </w:numPr>
-      </w:pPr>
-      <w:r>
-        <w:t>Risk Metrics</w:t>
-      </w:r>
-    </w:p>
-    <w:p>
-      <w:pPr>
-        <w:numPr>
-          <w:ilvl w:val="0"/>
-          <w:numId w:val="9"/>
-        </w:numPr>
-      </w:pPr>
-      <w:r>
-        <w:t>Security Findings</w:t>
-      </w:r>
-    </w:p>
-    <w:p>
-      <w:pPr>
-        <w:numPr>
-          <w:ilvl w:val="0"/>
-          <w:numId w:val="9"/>
-        </w:numPr>
-      </w:pPr>
-      <w:r>
-        <w:t>Reliability Findings</w:t>
-      </w:r>
-    </w:p>
-    <w:p>
-      <w:pPr>
-        <w:numPr>
-          <w:ilvl w:val="0"/>
-          <w:numId w:val="9"/>
-        </w:numPr>
-      </w:pPr>
-      <w:r>
-        <w:t>Final Investigation Report</w:t>
-      </w:r>
-    </w:p>
-    <w:p>
-      <w:r>
-        <w:pict w14:anchorId="264F52DD">
-          <v:rect id="_x0000_i1078" style="width:0;height:1.5pt" o:hralign="center" o:hrstd="t" o:hr="t" fillcolor="#a0a0a0" stroked="f"/>
-        </w:pict>
-      </w:r>
-    </w:p>
-    <w:p>
-      <w:pPr>
-        <w:rPr>
-          <w:b/>
-          <w:bCs/>
-        </w:rPr>
-      </w:pPr>
-      <w:r>
-        <w:rPr>
-          <w:b/>
-          <w:bCs/>
-        </w:rPr>
-        <w:t>7. Functional Requirements</w:t>
-      </w:r>
-    </w:p>
-    <w:p>
-      <w:pPr>
-        <w:numPr>
-          <w:ilvl w:val="0"/>
-          <w:numId w:val="10"/>
-        </w:numPr>
-      </w:pPr>
-      <w:r>
-        <w:t>FR1: The system shall allow users to initiate a new AI investigation.</w:t>
-      </w:r>
-    </w:p>
-    <w:p>
-      <w:pPr>
-        <w:numPr>
-          <w:ilvl w:val="0"/>
-          <w:numId w:val="10"/>
-        </w:numPr>
-      </w:pPr>
-      <w:r>
-        <w:t>FR2: The system shall support multiple investigation modes.</w:t>
-      </w:r>
-    </w:p>
-    <w:p>
-      <w:pPr>
-        <w:numPr>
-          <w:ilvl w:val="0"/>
-          <w:numId w:val="10"/>
-        </w:numPr>
-      </w:pPr>
-      <w:r>
-        <w:t>FR3: The system shall orchestrate specialized investigation agents.</w:t>
-      </w:r>
-    </w:p>
-    <w:p>
-      <w:pPr>
-        <w:numPr>
-          <w:ilvl w:val="0"/>
-          <w:numId w:val="10"/>
-        </w:numPr>
-      </w:pPr>
-      <w:r>
-        <w:t>FR4: The system shall detect prompt injection and jailbreak attempts.</w:t>
-      </w:r>
-    </w:p>
-    <w:p>
-      <w:pPr>
-        <w:numPr>
-          <w:ilvl w:val="0"/>
-          <w:numId w:val="10"/>
-        </w:numPr>
-      </w:pPr>
-      <w:r>
-        <w:t>FR5: The system shall evaluate AI reliability and behavioural consistency.</w:t>
-      </w:r>
-    </w:p>
-    <w:p>
-      <w:pPr>
-        <w:numPr>
-          <w:ilvl w:val="0"/>
-          <w:numId w:val="10"/>
-        </w:numPr>
-      </w:pPr>
-      <w:r>
-        <w:t>FR6: The system shall generate explainable investigation reports.</w:t>
-      </w:r>
-    </w:p>
-    <w:p>
-      <w:pPr>
-        <w:numPr>
-          <w:ilvl w:val="0"/>
-          <w:numId w:val="10"/>
-        </w:numPr>
-      </w:pPr>
-      <w:r>
-        <w:t>FR7: The system shall maintain investigation logs.</w:t>
-      </w:r>
-    </w:p>
-    <w:p>
-      <w:r>
-        <w:pict w14:anchorId="4C2A9E28">
-          <v:rect id="_x0000_i1079" style="width:0;height:1.5pt" o:hralign="center" o:hrstd="t" o:hr="t" fillcolor="#a0a0a0" stroked="f"/>
-        </w:pict>
-      </w:r>
-    </w:p>
-    <w:p>
-      <w:pPr>
-        <w:rPr>
-          <w:b/>
-          <w:bCs/>
-        </w:rPr>
-      </w:pPr>
-      <w:r>
-        <w:rPr>
-          <w:b/>
-          <w:bCs/>
-        </w:rPr>
-        <w:t>8. Quality Requirements</w:t>
-      </w:r>
-    </w:p>
-    <w:p>
-      <w:pPr>
-        <w:rPr>
-          <w:b/>
-          <w:bCs/>
-        </w:rPr>
-      </w:pPr>
-      <w:r>
-        <w:rPr>
-          <w:b/>
-          <w:bCs/>
-        </w:rPr>
-        <w:t>Reliability</w:t>
-      </w:r>
-    </w:p>
-    <w:p>
-      <w:r>
-        <w:t>The platform shall consistently produce dependable investigation outcomes and maintain reproducible analysis across repeated executions.</w:t>
-      </w:r>
-    </w:p>
-    <w:p>
-      <w:pPr>
-        <w:rPr>
-          <w:b/>
-          <w:bCs/>
-        </w:rPr>
-      </w:pPr>
-      <w:r>
-        <w:rPr>
-          <w:b/>
-          <w:bCs/>
-        </w:rPr>
-        <w:t>Explainability</w:t>
-      </w:r>
-    </w:p>
-    <w:p>
-      <w:r>
-        <w:lastRenderedPageBreak/>
-        <w:t>Every identified vulnerability or reliability issue shall be accompanied by supporting evidence and actionable recommendations.</w:t>
-      </w:r>
-    </w:p>
-    <w:p>
-      <w:pPr>
-        <w:rPr>
-          <w:b/>
-          <w:bCs/>
-        </w:rPr>
-      </w:pPr>
-      <w:r>
-        <w:rPr>
-          <w:b/>
-          <w:bCs/>
-        </w:rPr>
-        <w:t>Maintainability</w:t>
-      </w:r>
-    </w:p>
-    <w:p>
-      <w:r>
-        <w:t>The platform shall adopt a modular multi-agent architecture enabling new investigation agents and attack strategies to be integrated with minimal architectural changes.</w:t>
-      </w:r>
-    </w:p>
-    <w:p>
-      <w:r>
-        <w:pict w14:anchorId="1A025560">
-          <v:rect id="_x0000_i1080" style="width:0;height:1.5pt" o:hralign="center" o:hrstd="t" o:hr="t" fillcolor="#a0a0a0" stroked="f"/>
-        </w:pict>
-      </w:r>
-    </w:p>
-    <w:p>
-      <w:pPr>
-        <w:rPr>
-          <w:b/>
-          <w:bCs/>
-        </w:rPr>
-      </w:pPr>
-      <w:r>
-        <w:rPr>
-          <w:b/>
-          <w:bCs/>
-        </w:rPr>
-        <w:t>9. Measurable Goals</w:t>
+          <w:rFonts w:ascii="Cambria" w:hAnsi="Cambria" w:cs="Times New Roman"/>
+        </w:rPr>
+      </w:pPr>
+      <w:r>
+        <w:rPr>
+          <w:rFonts w:ascii="Cambria" w:hAnsi="Cambria" w:cs="Times New Roman"/>
+        </w:rPr>
+        <w:t>2.4 Measurable Goals</w:t>
       </w:r>
     </w:p>
     <w:tbl>
@@ -1164,9 +956,9 @@
         <w:tblLook w:val="04A0" w:firstRow="1" w:lastRow="0" w:firstColumn="1" w:lastColumn="0" w:noHBand="0" w:noVBand="1"/>
       </w:tblPr>
       <w:tblGrid>
-        <w:gridCol w:w="2649"/>
-        <w:gridCol w:w="3390"/>
-        <w:gridCol w:w="2987"/>
+        <w:gridCol w:w="2850"/>
+        <w:gridCol w:w="3115"/>
+        <w:gridCol w:w="2173"/>
       </w:tblGrid>
       <w:tr>
         <w:trPr>
@@ -1182,16 +974,14 @@
           <w:p>
             <w:pPr>
               <w:rPr>
-                <w:b/>
-                <w:bCs/>
+                <w:rFonts w:ascii="Cambria" w:hAnsi="Cambria" w:cs="Times New Roman"/>
               </w:rPr>
             </w:pPr>
             <w:r>
               <w:rPr>
-                <w:b/>
-                <w:bCs/>
+                <w:rFonts w:ascii="Cambria" w:hAnsi="Cambria" w:cs="Times New Roman"/>
               </w:rPr>
-              <w:t>Goal</w:t>
+              <w:t>Objective</w:t>
             </w:r>
           </w:p>
         </w:tc>
@@ -1204,16 +994,14 @@
           <w:p>
             <w:pPr>
               <w:rPr>
-                <w:b/>
-                <w:bCs/>
+                <w:rFonts w:ascii="Cambria" w:hAnsi="Cambria" w:cs="Times New Roman"/>
               </w:rPr>
             </w:pPr>
             <w:r>
               <w:rPr>
-                <w:b/>
-                <w:bCs/>
+                <w:rFonts w:ascii="Cambria" w:hAnsi="Cambria" w:cs="Times New Roman"/>
               </w:rPr>
-              <w:t>Metric</w:t>
+              <w:t>Measurement Metric</w:t>
             </w:r>
           </w:p>
         </w:tc>
@@ -1226,14 +1014,12 @@
           <w:p>
             <w:pPr>
               <w:rPr>
-                <w:b/>
-                <w:bCs/>
+                <w:rFonts w:ascii="Cambria" w:hAnsi="Cambria" w:cs="Times New Roman"/>
               </w:rPr>
             </w:pPr>
             <w:r>
               <w:rPr>
-                <w:b/>
-                <w:bCs/>
+                <w:rFonts w:ascii="Cambria" w:hAnsi="Cambria" w:cs="Times New Roman"/>
               </w:rPr>
               <w:t>Target</w:t>
             </w:r>
@@ -1251,7 +1037,15 @@
             <w:hideMark/>
           </w:tcPr>
           <w:p>
+            <w:pPr>
+              <w:rPr>
+                <w:rFonts w:ascii="Cambria" w:hAnsi="Cambria" w:cs="Times New Roman"/>
+              </w:rPr>
+            </w:pPr>
             <w:r>
+              <w:rPr>
+                <w:rFonts w:ascii="Cambria" w:hAnsi="Cambria" w:cs="Times New Roman"/>
+              </w:rPr>
               <w:t>Prompt Injection Detection</w:t>
             </w:r>
           </w:p>
@@ -1263,8 +1057,16 @@
             <w:hideMark/>
           </w:tcPr>
           <w:p>
+            <w:pPr>
+              <w:rPr>
+                <w:rFonts w:ascii="Cambria" w:hAnsi="Cambria" w:cs="Times New Roman"/>
+              </w:rPr>
+            </w:pPr>
             <w:r>
-              <w:t>Detection Rate</w:t>
+              <w:rPr>
+                <w:rFonts w:ascii="Cambria" w:hAnsi="Cambria" w:cs="Times New Roman"/>
+              </w:rPr>
+              <w:t>Detection Accuracy</w:t>
             </w:r>
           </w:p>
         </w:tc>
@@ -1275,7 +1077,15 @@
             <w:hideMark/>
           </w:tcPr>
           <w:p>
+            <w:pPr>
+              <w:rPr>
+                <w:rFonts w:ascii="Cambria" w:hAnsi="Cambria" w:cs="Times New Roman"/>
+              </w:rPr>
+            </w:pPr>
             <w:r>
+              <w:rPr>
+                <w:rFonts w:ascii="Cambria" w:hAnsi="Cambria" w:cs="Times New Roman"/>
+              </w:rPr>
               <w:t>≥ 90%</w:t>
             </w:r>
           </w:p>
@@ -1292,8 +1102,16 @@
             <w:hideMark/>
           </w:tcPr>
           <w:p>
+            <w:pPr>
+              <w:rPr>
+                <w:rFonts w:ascii="Cambria" w:hAnsi="Cambria" w:cs="Times New Roman"/>
+              </w:rPr>
+            </w:pPr>
             <w:r>
-              <w:t>Investigation Completion</w:t>
+              <w:rPr>
+                <w:rFonts w:ascii="Cambria" w:hAnsi="Cambria" w:cs="Times New Roman"/>
+              </w:rPr>
+              <w:t>Reliability Assessment</w:t>
             </w:r>
           </w:p>
         </w:tc>
@@ -1304,8 +1122,16 @@
             <w:hideMark/>
           </w:tcPr>
           <w:p>
+            <w:pPr>
+              <w:rPr>
+                <w:rFonts w:ascii="Cambria" w:hAnsi="Cambria" w:cs="Times New Roman"/>
+              </w:rPr>
+            </w:pPr>
             <w:r>
-              <w:t>Processing Time</w:t>
+              <w:rPr>
+                <w:rFonts w:ascii="Cambria" w:hAnsi="Cambria" w:cs="Times New Roman"/>
+              </w:rPr>
+              <w:t>Response Coverage</w:t>
             </w:r>
           </w:p>
         </w:tc>
@@ -1316,48 +1142,15 @@
             <w:hideMark/>
           </w:tcPr>
           <w:p>
+            <w:pPr>
+              <w:rPr>
+                <w:rFonts w:ascii="Cambria" w:hAnsi="Cambria" w:cs="Times New Roman"/>
+              </w:rPr>
+            </w:pPr>
             <w:r>
-              <w:t>&lt; 10 seconds (typical case)</w:t>
-            </w:r>
-          </w:p>
-        </w:tc>
-      </w:tr>
-      <w:tr>
-        <w:trPr>
-          <w:tblCellSpacing w:w="15" w:type="dxa"/>
-        </w:trPr>
-        <w:tc>
-          <w:tcPr>
-            <w:tcW w:w="0" w:type="auto"/>
-            <w:vAlign w:val="center"/>
-            <w:hideMark/>
-          </w:tcPr>
-          <w:p>
-            <w:r>
-              <w:t>Report Generation</w:t>
-            </w:r>
-          </w:p>
-        </w:tc>
-        <w:tc>
-          <w:tcPr>
-            <w:tcW w:w="0" w:type="auto"/>
-            <w:vAlign w:val="center"/>
-            <w:hideMark/>
-          </w:tcPr>
-          <w:p>
-            <w:r>
-              <w:t>Completion Rate</w:t>
-            </w:r>
-          </w:p>
-        </w:tc>
-        <w:tc>
-          <w:tcPr>
-            <w:tcW w:w="0" w:type="auto"/>
-            <w:vAlign w:val="center"/>
-            <w:hideMark/>
-          </w:tcPr>
-          <w:p>
-            <w:r>
+              <w:rPr>
+                <w:rFonts w:ascii="Cambria" w:hAnsi="Cambria" w:cs="Times New Roman"/>
+              </w:rPr>
               <w:t>100%</w:t>
             </w:r>
           </w:p>
@@ -1374,8 +1167,16 @@
             <w:hideMark/>
           </w:tcPr>
           <w:p>
+            <w:pPr>
+              <w:rPr>
+                <w:rFonts w:ascii="Cambria" w:hAnsi="Cambria" w:cs="Times New Roman"/>
+              </w:rPr>
+            </w:pPr>
             <w:r>
-              <w:t>Recommendation Quality</w:t>
+              <w:rPr>
+                <w:rFonts w:ascii="Cambria" w:hAnsi="Cambria" w:cs="Times New Roman"/>
+              </w:rPr>
+              <w:t>Investigation Completion</w:t>
             </w:r>
           </w:p>
         </w:tc>
@@ -1386,8 +1187,16 @@
             <w:hideMark/>
           </w:tcPr>
           <w:p>
+            <w:pPr>
+              <w:rPr>
+                <w:rFonts w:ascii="Cambria" w:hAnsi="Cambria" w:cs="Times New Roman"/>
+              </w:rPr>
+            </w:pPr>
             <w:r>
-              <w:t>Recommendations per Investigation</w:t>
+              <w:rPr>
+                <w:rFonts w:ascii="Cambria" w:hAnsi="Cambria" w:cs="Times New Roman"/>
+              </w:rPr>
+              <w:t>Processing Time</w:t>
             </w:r>
           </w:p>
         </w:tc>
@@ -1398,8 +1207,16 @@
             <w:hideMark/>
           </w:tcPr>
           <w:p>
+            <w:pPr>
+              <w:rPr>
+                <w:rFonts w:ascii="Cambria" w:hAnsi="Cambria" w:cs="Times New Roman"/>
+              </w:rPr>
+            </w:pPr>
             <w:r>
-              <w:t>≥ 3</w:t>
+              <w:rPr>
+                <w:rFonts w:ascii="Cambria" w:hAnsi="Cambria" w:cs="Times New Roman"/>
+              </w:rPr>
+              <w:t>&lt; 10 seconds</w:t>
             </w:r>
           </w:p>
         </w:tc>
@@ -1415,8 +1232,17 @@
             <w:hideMark/>
           </w:tcPr>
           <w:p>
+            <w:pPr>
+              <w:rPr>
+                <w:rFonts w:ascii="Cambria" w:hAnsi="Cambria" w:cs="Times New Roman"/>
+              </w:rPr>
+            </w:pPr>
             <w:r>
-              <w:t>Modular Extensibility</w:t>
+              <w:rPr>
+                <w:rFonts w:ascii="Cambria" w:hAnsi="Cambria" w:cs="Times New Roman"/>
+              </w:rPr>
+              <w:lastRenderedPageBreak/>
+              <w:t>Report Generation</w:t>
             </w:r>
           </w:p>
         </w:tc>
@@ -1427,8 +1253,16 @@
             <w:hideMark/>
           </w:tcPr>
           <w:p>
+            <w:pPr>
+              <w:rPr>
+                <w:rFonts w:ascii="Cambria" w:hAnsi="Cambria" w:cs="Times New Roman"/>
+              </w:rPr>
+            </w:pPr>
             <w:r>
-              <w:t>New Agent Integration</w:t>
+              <w:rPr>
+                <w:rFonts w:ascii="Cambria" w:hAnsi="Cambria" w:cs="Times New Roman"/>
+              </w:rPr>
+              <w:t>Successful Report Creation</w:t>
             </w:r>
           </w:p>
         </w:tc>
@@ -1439,14 +1273,94 @@
             <w:hideMark/>
           </w:tcPr>
           <w:p>
+            <w:pPr>
+              <w:rPr>
+                <w:rFonts w:ascii="Cambria" w:hAnsi="Cambria" w:cs="Times New Roman"/>
+              </w:rPr>
+            </w:pPr>
             <w:r>
-              <w:t>Without modifying existing agents</w:t>
+              <w:rPr>
+                <w:rFonts w:ascii="Cambria" w:hAnsi="Cambria" w:cs="Times New Roman"/>
+              </w:rPr>
+              <w:t>100%</w:t>
+            </w:r>
+          </w:p>
+        </w:tc>
+      </w:tr>
+      <w:tr>
+        <w:trPr>
+          <w:tblCellSpacing w:w="15" w:type="dxa"/>
+        </w:trPr>
+        <w:tc>
+          <w:tcPr>
+            <w:tcW w:w="0" w:type="auto"/>
+            <w:vAlign w:val="center"/>
+            <w:hideMark/>
+          </w:tcPr>
+          <w:p>
+            <w:pPr>
+              <w:rPr>
+                <w:rFonts w:ascii="Cambria" w:hAnsi="Cambria" w:cs="Times New Roman"/>
+              </w:rPr>
+            </w:pPr>
+            <w:r>
+              <w:rPr>
+                <w:rFonts w:ascii="Cambria" w:hAnsi="Cambria" w:cs="Times New Roman"/>
+              </w:rPr>
+              <w:t>Recommendation Quality</w:t>
+            </w:r>
+          </w:p>
+        </w:tc>
+        <w:tc>
+          <w:tcPr>
+            <w:tcW w:w="0" w:type="auto"/>
+            <w:vAlign w:val="center"/>
+            <w:hideMark/>
+          </w:tcPr>
+          <w:p>
+            <w:pPr>
+              <w:rPr>
+                <w:rFonts w:ascii="Cambria" w:hAnsi="Cambria" w:cs="Times New Roman"/>
+              </w:rPr>
+            </w:pPr>
+            <w:r>
+              <w:rPr>
+                <w:rFonts w:ascii="Cambria" w:hAnsi="Cambria" w:cs="Times New Roman"/>
+              </w:rPr>
+              <w:t>Actionable Recommendations</w:t>
+            </w:r>
+          </w:p>
+        </w:tc>
+        <w:tc>
+          <w:tcPr>
+            <w:tcW w:w="0" w:type="auto"/>
+            <w:vAlign w:val="center"/>
+            <w:hideMark/>
+          </w:tcPr>
+          <w:p>
+            <w:pPr>
+              <w:rPr>
+                <w:rFonts w:ascii="Cambria" w:hAnsi="Cambria" w:cs="Times New Roman"/>
+              </w:rPr>
+            </w:pPr>
+            <w:r>
+              <w:rPr>
+                <w:rFonts w:ascii="Cambria" w:hAnsi="Cambria" w:cs="Times New Roman"/>
+              </w:rPr>
+              <w:t>≥ 3 per investigation</w:t>
             </w:r>
           </w:p>
         </w:tc>
       </w:tr>
     </w:tbl>
-    <w:p/>
+    <w:p>
+      <w:pPr>
+        <w:rPr>
+          <w:rFonts w:ascii="Cambria" w:hAnsi="Cambria" w:cs="Times New Roman"/>
+          <w:lang w:val="en-US"/>
+        </w:rPr>
+      </w:pPr>
+    </w:p>
     <w:sectPr>
       <w:pgSz w:w="11906" w:h="16838"/>
       <w:pgMar w:top="1440" w:right="1440" w:bottom="1440" w:left="1440" w:header="708" w:footer="708" w:gutter="0"/>
@@ -1460,6 +1374,155 @@
 <file path=word/numbering.xml><?xml version="1.0" encoding="utf-8"?>
 <w:numbering xmlns:wpc="http://schemas.microsoft.com/office/word/2010/wordprocessingCanvas" xmlns:cx="http://schemas.microsoft.com/office/drawing/2014/chartex" xmlns:cx1="http://schemas.microsoft.com/office/drawing/2015/9/8/chartex" xmlns:cx2="http://schemas.microsoft.com/office/drawing/2015/10/21/chartex" xmlns:cx3="http://schemas.microsoft.com/office/drawing/2016/5/9/chartex" xmlns:cx4="http://schemas.microsoft.com/office/drawing/2016/5/10/chartex" xmlns:cx5="http://schemas.microsoft.com/office/drawing/2016/5/11/chartex" xmlns:cx6="http://schemas.microsoft.com/office/drawing/2016/5/12/chartex" xmlns:cx7="http://schemas.microsoft.com/office/drawing/2016/5/13/chartex" xmlns:cx8="http://schemas.microsoft.com/office/drawing/2016/5/14/chartex" xmlns:mc="http://schemas.openxmlformats.org/markup-compatibility/2006" xmlns:aink="http://schemas.microsoft.com/office/drawing/2016/ink" xmlns:am3d="http://schemas.microsoft.com/office/drawing/2017/model3d" xmlns:o="urn:schemas-microsoft-com:office:office" xmlns:oel="http://schemas.microsoft.com/office/2019/extlst" xmlns:r="http://schemas.openxmlformats.org/officeDocument/2006/relationships" xmlns:m="http://schemas.openxmlformats.org/officeDocument/2006/math" xmlns:v="urn:schemas-microsoft-com:vml" xmlns:wp14="http://schemas.microsoft.com/office/word/2010/wordprocessingDrawing" xmlns:wp="http://schemas.openxmlformats.org/drawingml/2006/wordprocessingDrawing" xmlns:w10="urn:schemas-microsoft-com:office:word" xmlns:w="http://schemas.openxmlformats.org/wordprocessingml/2006/main" xmlns:w14="http://schemas.microsoft.com/office/word/2010/wordml" xmlns:w15="http://schemas.microsoft.com/office/word/2012/wordml" xmlns:w16cex="http://schemas.microsoft.com/office/word/2018/wordml/cex" xmlns:w16cid="http://schemas.microsoft.com/office/word/2016/wordml/cid" xmlns:w16="http://schemas.microsoft.com/office/word/2018/wordml" xmlns:w16du="http://schemas.microsoft.com/office/word/2023/wordml/word16du" xmlns:w16sdtdh="http://schemas.microsoft.com/office/word/2020/wordml/sdtdatahash" xmlns:w16sdtfl="http://schemas.microsoft.com/office/word/2024/wordml/sdtformatlock" xmlns:w16se="http://schemas.microsoft.com/office/word/2015/wordml/symex" xmlns:wpg="http://schemas.microsoft.com/office/word/2010/wordprocessingGroup" xmlns:wpi="http://schemas.microsoft.com/office/word/2010/wordprocessingInk" xmlns:wne="http://schemas.microsoft.com/office/word/2006/wordml" xmlns:wps="http://schemas.microsoft.com/office/word/2010/wordprocessingShape" mc:Ignorable="w14 w15 w16se w16cid w16 w16cex w16sdtdh w16sdtfl w16du wp14">
   <w:abstractNum w:abstractNumId="0" w15:restartNumberingAfterBreak="0">
+    <w:nsid w:val="06EB19A6"/>
+    <w:multiLevelType w:val="multilevel"/>
+    <w:tmpl w:val="343670BA"/>
+    <w:lvl w:ilvl="0">
+      <w:start w:val="1"/>
+      <w:numFmt w:val="bullet"/>
+      <w:lvlText w:val=""/>
+      <w:lvlJc w:val="left"/>
+      <w:pPr>
+        <w:tabs>
+          <w:tab w:val="num" w:pos="720"/>
+        </w:tabs>
+        <w:ind w:left="720" w:hanging="360"/>
+      </w:pPr>
+      <w:rPr>
+        <w:rFonts w:ascii="Symbol" w:hAnsi="Symbol" w:hint="default"/>
+        <w:sz w:val="20"/>
+      </w:rPr>
+    </w:lvl>
+    <w:lvl w:ilvl="1" w:tentative="1">
+      <w:start w:val="1"/>
+      <w:numFmt w:val="bullet"/>
+      <w:lvlText w:val="o"/>
+      <w:lvlJc w:val="left"/>
+      <w:pPr>
+        <w:tabs>
+          <w:tab w:val="num" w:pos="1440"/>
+        </w:tabs>
+        <w:ind w:left="1440" w:hanging="360"/>
+      </w:pPr>
+      <w:rPr>
+        <w:rFonts w:ascii="Courier New" w:hAnsi="Courier New" w:hint="default"/>
+        <w:sz w:val="20"/>
+      </w:rPr>
+    </w:lvl>
+    <w:lvl w:ilvl="2" w:tentative="1">
+      <w:start w:val="1"/>
+      <w:numFmt w:val="bullet"/>
+      <w:lvlText w:val=""/>
+      <w:lvlJc w:val="left"/>
+      <w:pPr>
+        <w:tabs>
+          <w:tab w:val="num" w:pos="2160"/>
+        </w:tabs>
+        <w:ind w:left="2160" w:hanging="360"/>
+      </w:pPr>
+      <w:rPr>
+        <w:rFonts w:ascii="Wingdings" w:hAnsi="Wingdings" w:hint="default"/>
+        <w:sz w:val="20"/>
+      </w:rPr>
+    </w:lvl>
+    <w:lvl w:ilvl="3" w:tentative="1">
+      <w:start w:val="1"/>
+      <w:numFmt w:val="bullet"/>
+      <w:lvlText w:val=""/>
+      <w:lvlJc w:val="left"/>
+      <w:pPr>
+        <w:tabs>
+          <w:tab w:val="num" w:pos="2880"/>
+        </w:tabs>
+        <w:ind w:left="2880" w:hanging="360"/>
+      </w:pPr>
+      <w:rPr>
+        <w:rFonts w:ascii="Wingdings" w:hAnsi="Wingdings" w:hint="default"/>
+        <w:sz w:val="20"/>
+      </w:rPr>
+    </w:lvl>
+    <w:lvl w:ilvl="4" w:tentative="1">
+      <w:start w:val="1"/>
+      <w:numFmt w:val="bullet"/>
+      <w:lvlText w:val=""/>
+      <w:lvlJc w:val="left"/>
+      <w:pPr>
+        <w:tabs>
+          <w:tab w:val="num" w:pos="3600"/>
+        </w:tabs>
+        <w:ind w:left="3600" w:hanging="360"/>
+      </w:pPr>
+      <w:rPr>
+        <w:rFonts w:ascii="Wingdings" w:hAnsi="Wingdings" w:hint="default"/>
+        <w:sz w:val="20"/>
+      </w:rPr>
+    </w:lvl>
+    <w:lvl w:ilvl="5" w:tentative="1">
+      <w:start w:val="1"/>
+      <w:numFmt w:val="bullet"/>
+      <w:lvlText w:val=""/>
+      <w:lvlJc w:val="left"/>
+      <w:pPr>
+        <w:tabs>
+          <w:tab w:val="num" w:pos="4320"/>
+        </w:tabs>
+        <w:ind w:left="4320" w:hanging="360"/>
+      </w:pPr>
+      <w:rPr>
+        <w:rFonts w:ascii="Wingdings" w:hAnsi="Wingdings" w:hint="default"/>
+        <w:sz w:val="20"/>
+      </w:rPr>
+    </w:lvl>
+    <w:lvl w:ilvl="6" w:tentative="1">
+      <w:start w:val="1"/>
+      <w:numFmt w:val="bullet"/>
+      <w:lvlText w:val=""/>
+      <w:lvlJc w:val="left"/>
+      <w:pPr>
+        <w:tabs>
+          <w:tab w:val="num" w:pos="5040"/>
+        </w:tabs>
+        <w:ind w:left="5040" w:hanging="360"/>
+      </w:pPr>
+      <w:rPr>
+        <w:rFonts w:ascii="Wingdings" w:hAnsi="Wingdings" w:hint="default"/>
+        <w:sz w:val="20"/>
+      </w:rPr>
+    </w:lvl>
+    <w:lvl w:ilvl="7" w:tentative="1">
+      <w:start w:val="1"/>
+      <w:numFmt w:val="bullet"/>
+      <w:lvlText w:val=""/>
+      <w:lvlJc w:val="left"/>
+      <w:pPr>
+        <w:tabs>
+          <w:tab w:val="num" w:pos="5760"/>
+        </w:tabs>
+        <w:ind w:left="5760" w:hanging="360"/>
+      </w:pPr>
+      <w:rPr>
+        <w:rFonts w:ascii="Wingdings" w:hAnsi="Wingdings" w:hint="default"/>
+        <w:sz w:val="20"/>
+      </w:rPr>
+    </w:lvl>
+    <w:lvl w:ilvl="8" w:tentative="1">
+      <w:start w:val="1"/>
+      <w:numFmt w:val="bullet"/>
+      <w:lvlText w:val=""/>
+      <w:lvlJc w:val="left"/>
+      <w:pPr>
+        <w:tabs>
+          <w:tab w:val="num" w:pos="6480"/>
+        </w:tabs>
+        <w:ind w:left="6480" w:hanging="360"/>
+      </w:pPr>
+      <w:rPr>
+        <w:rFonts w:ascii="Wingdings" w:hAnsi="Wingdings" w:hint="default"/>
+        <w:sz w:val="20"/>
+      </w:rPr>
+    </w:lvl>
+  </w:abstractNum>
+  <w:abstractNum w:abstractNumId="1" w15:restartNumberingAfterBreak="0">
     <w:nsid w:val="0941209B"/>
     <w:multiLevelType w:val="multilevel"/>
     <w:tmpl w:val="0F04856E"/>
@@ -1608,7 +1671,7 @@
       </w:rPr>
     </w:lvl>
   </w:abstractNum>
-  <w:abstractNum w:abstractNumId="1" w15:restartNumberingAfterBreak="0">
+  <w:abstractNum w:abstractNumId="2" w15:restartNumberingAfterBreak="0">
     <w:nsid w:val="0AB20524"/>
     <w:multiLevelType w:val="multilevel"/>
     <w:tmpl w:val="DFDCA52A"/>
@@ -1757,7 +1820,454 @@
       </w:rPr>
     </w:lvl>
   </w:abstractNum>
-  <w:abstractNum w:abstractNumId="2" w15:restartNumberingAfterBreak="0">
+  <w:abstractNum w:abstractNumId="3" w15:restartNumberingAfterBreak="0">
+    <w:nsid w:val="109F66DD"/>
+    <w:multiLevelType w:val="multilevel"/>
+    <w:tmpl w:val="DD6C319E"/>
+    <w:lvl w:ilvl="0">
+      <w:start w:val="1"/>
+      <w:numFmt w:val="bullet"/>
+      <w:lvlText w:val=""/>
+      <w:lvlJc w:val="left"/>
+      <w:pPr>
+        <w:tabs>
+          <w:tab w:val="num" w:pos="720"/>
+        </w:tabs>
+        <w:ind w:left="720" w:hanging="360"/>
+      </w:pPr>
+      <w:rPr>
+        <w:rFonts w:ascii="Symbol" w:hAnsi="Symbol" w:hint="default"/>
+        <w:sz w:val="20"/>
+      </w:rPr>
+    </w:lvl>
+    <w:lvl w:ilvl="1" w:tentative="1">
+      <w:start w:val="1"/>
+      <w:numFmt w:val="bullet"/>
+      <w:lvlText w:val="o"/>
+      <w:lvlJc w:val="left"/>
+      <w:pPr>
+        <w:tabs>
+          <w:tab w:val="num" w:pos="1440"/>
+        </w:tabs>
+        <w:ind w:left="1440" w:hanging="360"/>
+      </w:pPr>
+      <w:rPr>
+        <w:rFonts w:ascii="Courier New" w:hAnsi="Courier New" w:hint="default"/>
+        <w:sz w:val="20"/>
+      </w:rPr>
+    </w:lvl>
+    <w:lvl w:ilvl="2" w:tentative="1">
+      <w:start w:val="1"/>
+      <w:numFmt w:val="bullet"/>
+      <w:lvlText w:val=""/>
+      <w:lvlJc w:val="left"/>
+      <w:pPr>
+        <w:tabs>
+          <w:tab w:val="num" w:pos="2160"/>
+        </w:tabs>
+        <w:ind w:left="2160" w:hanging="360"/>
+      </w:pPr>
+      <w:rPr>
+        <w:rFonts w:ascii="Wingdings" w:hAnsi="Wingdings" w:hint="default"/>
+        <w:sz w:val="20"/>
+      </w:rPr>
+    </w:lvl>
+    <w:lvl w:ilvl="3" w:tentative="1">
+      <w:start w:val="1"/>
+      <w:numFmt w:val="bullet"/>
+      <w:lvlText w:val=""/>
+      <w:lvlJc w:val="left"/>
+      <w:pPr>
+        <w:tabs>
+          <w:tab w:val="num" w:pos="2880"/>
+        </w:tabs>
+        <w:ind w:left="2880" w:hanging="360"/>
+      </w:pPr>
+      <w:rPr>
+        <w:rFonts w:ascii="Wingdings" w:hAnsi="Wingdings" w:hint="default"/>
+        <w:sz w:val="20"/>
+      </w:rPr>
+    </w:lvl>
+    <w:lvl w:ilvl="4" w:tentative="1">
+      <w:start w:val="1"/>
+      <w:numFmt w:val="bullet"/>
+      <w:lvlText w:val=""/>
+      <w:lvlJc w:val="left"/>
+      <w:pPr>
+        <w:tabs>
+          <w:tab w:val="num" w:pos="3600"/>
+        </w:tabs>
+        <w:ind w:left="3600" w:hanging="360"/>
+      </w:pPr>
+      <w:rPr>
+        <w:rFonts w:ascii="Wingdings" w:hAnsi="Wingdings" w:hint="default"/>
+        <w:sz w:val="20"/>
+      </w:rPr>
+    </w:lvl>
+    <w:lvl w:ilvl="5" w:tentative="1">
+      <w:start w:val="1"/>
+      <w:numFmt w:val="bullet"/>
+      <w:lvlText w:val=""/>
+      <w:lvlJc w:val="left"/>
+      <w:pPr>
+        <w:tabs>
+          <w:tab w:val="num" w:pos="4320"/>
+        </w:tabs>
+        <w:ind w:left="4320" w:hanging="360"/>
+      </w:pPr>
+      <w:rPr>
+        <w:rFonts w:ascii="Wingdings" w:hAnsi="Wingdings" w:hint="default"/>
+        <w:sz w:val="20"/>
+      </w:rPr>
+    </w:lvl>
+    <w:lvl w:ilvl="6" w:tentative="1">
+      <w:start w:val="1"/>
+      <w:numFmt w:val="bullet"/>
+      <w:lvlText w:val=""/>
+      <w:lvlJc w:val="left"/>
+      <w:pPr>
+        <w:tabs>
+          <w:tab w:val="num" w:pos="5040"/>
+        </w:tabs>
+        <w:ind w:left="5040" w:hanging="360"/>
+      </w:pPr>
+      <w:rPr>
+        <w:rFonts w:ascii="Wingdings" w:hAnsi="Wingdings" w:hint="default"/>
+        <w:sz w:val="20"/>
+      </w:rPr>
+    </w:lvl>
+    <w:lvl w:ilvl="7" w:tentative="1">
+      <w:start w:val="1"/>
+      <w:numFmt w:val="bullet"/>
+      <w:lvlText w:val=""/>
+      <w:lvlJc w:val="left"/>
+      <w:pPr>
+        <w:tabs>
+          <w:tab w:val="num" w:pos="5760"/>
+        </w:tabs>
+        <w:ind w:left="5760" w:hanging="360"/>
+      </w:pPr>
+      <w:rPr>
+        <w:rFonts w:ascii="Wingdings" w:hAnsi="Wingdings" w:hint="default"/>
+        <w:sz w:val="20"/>
+      </w:rPr>
+    </w:lvl>
+    <w:lvl w:ilvl="8" w:tentative="1">
+      <w:start w:val="1"/>
+      <w:numFmt w:val="bullet"/>
+      <w:lvlText w:val=""/>
+      <w:lvlJc w:val="left"/>
+      <w:pPr>
+        <w:tabs>
+          <w:tab w:val="num" w:pos="6480"/>
+        </w:tabs>
+        <w:ind w:left="6480" w:hanging="360"/>
+      </w:pPr>
+      <w:rPr>
+        <w:rFonts w:ascii="Wingdings" w:hAnsi="Wingdings" w:hint="default"/>
+        <w:sz w:val="20"/>
+      </w:rPr>
+    </w:lvl>
+  </w:abstractNum>
+  <w:abstractNum w:abstractNumId="4" w15:restartNumberingAfterBreak="0">
+    <w:nsid w:val="15A879A3"/>
+    <w:multiLevelType w:val="multilevel"/>
+    <w:tmpl w:val="6AD25C04"/>
+    <w:lvl w:ilvl="0">
+      <w:start w:val="1"/>
+      <w:numFmt w:val="bullet"/>
+      <w:lvlText w:val=""/>
+      <w:lvlJc w:val="left"/>
+      <w:pPr>
+        <w:tabs>
+          <w:tab w:val="num" w:pos="720"/>
+        </w:tabs>
+        <w:ind w:left="720" w:hanging="360"/>
+      </w:pPr>
+      <w:rPr>
+        <w:rFonts w:ascii="Symbol" w:hAnsi="Symbol" w:hint="default"/>
+        <w:sz w:val="20"/>
+      </w:rPr>
+    </w:lvl>
+    <w:lvl w:ilvl="1" w:tentative="1">
+      <w:start w:val="1"/>
+      <w:numFmt w:val="bullet"/>
+      <w:lvlText w:val="o"/>
+      <w:lvlJc w:val="left"/>
+      <w:pPr>
+        <w:tabs>
+          <w:tab w:val="num" w:pos="1440"/>
+        </w:tabs>
+        <w:ind w:left="1440" w:hanging="360"/>
+      </w:pPr>
+      <w:rPr>
+        <w:rFonts w:ascii="Courier New" w:hAnsi="Courier New" w:hint="default"/>
+        <w:sz w:val="20"/>
+      </w:rPr>
+    </w:lvl>
+    <w:lvl w:ilvl="2" w:tentative="1">
+      <w:start w:val="1"/>
+      <w:numFmt w:val="bullet"/>
+      <w:lvlText w:val=""/>
+      <w:lvlJc w:val="left"/>
+      <w:pPr>
+        <w:tabs>
+          <w:tab w:val="num" w:pos="2160"/>
+        </w:tabs>
+        <w:ind w:left="2160" w:hanging="360"/>
+      </w:pPr>
+      <w:rPr>
+        <w:rFonts w:ascii="Wingdings" w:hAnsi="Wingdings" w:hint="default"/>
+        <w:sz w:val="20"/>
+      </w:rPr>
+    </w:lvl>
+    <w:lvl w:ilvl="3" w:tentative="1">
+      <w:start w:val="1"/>
+      <w:numFmt w:val="bullet"/>
+      <w:lvlText w:val=""/>
+      <w:lvlJc w:val="left"/>
+      <w:pPr>
+        <w:tabs>
+          <w:tab w:val="num" w:pos="2880"/>
+        </w:tabs>
+        <w:ind w:left="2880" w:hanging="360"/>
+      </w:pPr>
+      <w:rPr>
+        <w:rFonts w:ascii="Wingdings" w:hAnsi="Wingdings" w:hint="default"/>
+        <w:sz w:val="20"/>
+      </w:rPr>
+    </w:lvl>
+    <w:lvl w:ilvl="4" w:tentative="1">
+      <w:start w:val="1"/>
+      <w:numFmt w:val="bullet"/>
+      <w:lvlText w:val=""/>
+      <w:lvlJc w:val="left"/>
+      <w:pPr>
+        <w:tabs>
+          <w:tab w:val="num" w:pos="3600"/>
+        </w:tabs>
+        <w:ind w:left="3600" w:hanging="360"/>
+      </w:pPr>
+      <w:rPr>
+        <w:rFonts w:ascii="Wingdings" w:hAnsi="Wingdings" w:hint="default"/>
+        <w:sz w:val="20"/>
+      </w:rPr>
+    </w:lvl>
+    <w:lvl w:ilvl="5" w:tentative="1">
+      <w:start w:val="1"/>
+      <w:numFmt w:val="bullet"/>
+      <w:lvlText w:val=""/>
+      <w:lvlJc w:val="left"/>
+      <w:pPr>
+        <w:tabs>
+          <w:tab w:val="num" w:pos="4320"/>
+        </w:tabs>
+        <w:ind w:left="4320" w:hanging="360"/>
+      </w:pPr>
+      <w:rPr>
+        <w:rFonts w:ascii="Wingdings" w:hAnsi="Wingdings" w:hint="default"/>
+        <w:sz w:val="20"/>
+      </w:rPr>
+    </w:lvl>
+    <w:lvl w:ilvl="6" w:tentative="1">
+      <w:start w:val="1"/>
+      <w:numFmt w:val="bullet"/>
+      <w:lvlText w:val=""/>
+      <w:lvlJc w:val="left"/>
+      <w:pPr>
+        <w:tabs>
+          <w:tab w:val="num" w:pos="5040"/>
+        </w:tabs>
+        <w:ind w:left="5040" w:hanging="360"/>
+      </w:pPr>
+      <w:rPr>
+        <w:rFonts w:ascii="Wingdings" w:hAnsi="Wingdings" w:hint="default"/>
+        <w:sz w:val="20"/>
+      </w:rPr>
+    </w:lvl>
+    <w:lvl w:ilvl="7" w:tentative="1">
+      <w:start w:val="1"/>
+      <w:numFmt w:val="bullet"/>
+      <w:lvlText w:val=""/>
+      <w:lvlJc w:val="left"/>
+      <w:pPr>
+        <w:tabs>
+          <w:tab w:val="num" w:pos="5760"/>
+        </w:tabs>
+        <w:ind w:left="5760" w:hanging="360"/>
+      </w:pPr>
+      <w:rPr>
+        <w:rFonts w:ascii="Wingdings" w:hAnsi="Wingdings" w:hint="default"/>
+        <w:sz w:val="20"/>
+      </w:rPr>
+    </w:lvl>
+    <w:lvl w:ilvl="8" w:tentative="1">
+      <w:start w:val="1"/>
+      <w:numFmt w:val="bullet"/>
+      <w:lvlText w:val=""/>
+      <w:lvlJc w:val="left"/>
+      <w:pPr>
+        <w:tabs>
+          <w:tab w:val="num" w:pos="6480"/>
+        </w:tabs>
+        <w:ind w:left="6480" w:hanging="360"/>
+      </w:pPr>
+      <w:rPr>
+        <w:rFonts w:ascii="Wingdings" w:hAnsi="Wingdings" w:hint="default"/>
+        <w:sz w:val="20"/>
+      </w:rPr>
+    </w:lvl>
+  </w:abstractNum>
+  <w:abstractNum w:abstractNumId="5" w15:restartNumberingAfterBreak="0">
+    <w:nsid w:val="376C636E"/>
+    <w:multiLevelType w:val="multilevel"/>
+    <w:tmpl w:val="8BF0ECAE"/>
+    <w:lvl w:ilvl="0">
+      <w:start w:val="1"/>
+      <w:numFmt w:val="bullet"/>
+      <w:lvlText w:val=""/>
+      <w:lvlJc w:val="left"/>
+      <w:pPr>
+        <w:tabs>
+          <w:tab w:val="num" w:pos="720"/>
+        </w:tabs>
+        <w:ind w:left="720" w:hanging="360"/>
+      </w:pPr>
+      <w:rPr>
+        <w:rFonts w:ascii="Symbol" w:hAnsi="Symbol" w:hint="default"/>
+        <w:sz w:val="20"/>
+      </w:rPr>
+    </w:lvl>
+    <w:lvl w:ilvl="1" w:tentative="1">
+      <w:start w:val="1"/>
+      <w:numFmt w:val="bullet"/>
+      <w:lvlText w:val="o"/>
+      <w:lvlJc w:val="left"/>
+      <w:pPr>
+        <w:tabs>
+          <w:tab w:val="num" w:pos="1440"/>
+        </w:tabs>
+        <w:ind w:left="1440" w:hanging="360"/>
+      </w:pPr>
+      <w:rPr>
+        <w:rFonts w:ascii="Courier New" w:hAnsi="Courier New" w:hint="default"/>
+        <w:sz w:val="20"/>
+      </w:rPr>
+    </w:lvl>
+    <w:lvl w:ilvl="2" w:tentative="1">
+      <w:start w:val="1"/>
+      <w:numFmt w:val="bullet"/>
+      <w:lvlText w:val=""/>
+      <w:lvlJc w:val="left"/>
+      <w:pPr>
+        <w:tabs>
+          <w:tab w:val="num" w:pos="2160"/>
+        </w:tabs>
+        <w:ind w:left="2160" w:hanging="360"/>
+      </w:pPr>
+      <w:rPr>
+        <w:rFonts w:ascii="Wingdings" w:hAnsi="Wingdings" w:hint="default"/>
+        <w:sz w:val="20"/>
+      </w:rPr>
+    </w:lvl>
+    <w:lvl w:ilvl="3" w:tentative="1">
+      <w:start w:val="1"/>
+      <w:numFmt w:val="bullet"/>
+      <w:lvlText w:val=""/>
+      <w:lvlJc w:val="left"/>
+      <w:pPr>
+        <w:tabs>
+          <w:tab w:val="num" w:pos="2880"/>
+        </w:tabs>
+        <w:ind w:left="2880" w:hanging="360"/>
+      </w:pPr>
+      <w:rPr>
+        <w:rFonts w:ascii="Wingdings" w:hAnsi="Wingdings" w:hint="default"/>
+        <w:sz w:val="20"/>
+      </w:rPr>
+    </w:lvl>
+    <w:lvl w:ilvl="4" w:tentative="1">
+      <w:start w:val="1"/>
+      <w:numFmt w:val="bullet"/>
+      <w:lvlText w:val=""/>
+      <w:lvlJc w:val="left"/>
+      <w:pPr>
+        <w:tabs>
+          <w:tab w:val="num" w:pos="3600"/>
+        </w:tabs>
+        <w:ind w:left="3600" w:hanging="360"/>
+      </w:pPr>
+      <w:rPr>
+        <w:rFonts w:ascii="Wingdings" w:hAnsi="Wingdings" w:hint="default"/>
+        <w:sz w:val="20"/>
+      </w:rPr>
+    </w:lvl>
+    <w:lvl w:ilvl="5" w:tentative="1">
+      <w:start w:val="1"/>
+      <w:numFmt w:val="bullet"/>
+      <w:lvlText w:val=""/>
+      <w:lvlJc w:val="left"/>
+      <w:pPr>
+        <w:tabs>
+          <w:tab w:val="num" w:pos="4320"/>
+        </w:tabs>
+        <w:ind w:left="4320" w:hanging="360"/>
+      </w:pPr>
+      <w:rPr>
+        <w:rFonts w:ascii="Wingdings" w:hAnsi="Wingdings" w:hint="default"/>
+        <w:sz w:val="20"/>
+      </w:rPr>
+    </w:lvl>
+    <w:lvl w:ilvl="6" w:tentative="1">
+      <w:start w:val="1"/>
+      <w:numFmt w:val="bullet"/>
+      <w:lvlText w:val=""/>
+      <w:lvlJc w:val="left"/>
+      <w:pPr>
+        <w:tabs>
+          <w:tab w:val="num" w:pos="5040"/>
+        </w:tabs>
+        <w:ind w:left="5040" w:hanging="360"/>
+      </w:pPr>
+      <w:rPr>
+        <w:rFonts w:ascii="Wingdings" w:hAnsi="Wingdings" w:hint="default"/>
+        <w:sz w:val="20"/>
+      </w:rPr>
+    </w:lvl>
+    <w:lvl w:ilvl="7" w:tentative="1">
+      <w:start w:val="1"/>
+      <w:numFmt w:val="bullet"/>
+      <w:lvlText w:val=""/>
+      <w:lvlJc w:val="left"/>
+      <w:pPr>
+        <w:tabs>
+          <w:tab w:val="num" w:pos="5760"/>
+        </w:tabs>
+        <w:ind w:left="5760" w:hanging="360"/>
+      </w:pPr>
+      <w:rPr>
+        <w:rFonts w:ascii="Wingdings" w:hAnsi="Wingdings" w:hint="default"/>
+        <w:sz w:val="20"/>
+      </w:rPr>
+    </w:lvl>
+    <w:lvl w:ilvl="8" w:tentative="1">
+      <w:start w:val="1"/>
+      <w:numFmt w:val="bullet"/>
+      <w:lvlText w:val=""/>
+      <w:lvlJc w:val="left"/>
+      <w:pPr>
+        <w:tabs>
+          <w:tab w:val="num" w:pos="6480"/>
+        </w:tabs>
+        <w:ind w:left="6480" w:hanging="360"/>
+      </w:pPr>
+      <w:rPr>
+        <w:rFonts w:ascii="Wingdings" w:hAnsi="Wingdings" w:hint="default"/>
+        <w:sz w:val="20"/>
+      </w:rPr>
+    </w:lvl>
+  </w:abstractNum>
+  <w:abstractNum w:abstractNumId="6" w15:restartNumberingAfterBreak="0">
     <w:nsid w:val="39412FC1"/>
     <w:multiLevelType w:val="multilevel"/>
     <w:tmpl w:val="9C0A931C"/>
@@ -1906,7 +2416,7 @@
       </w:rPr>
     </w:lvl>
   </w:abstractNum>
-  <w:abstractNum w:abstractNumId="3" w15:restartNumberingAfterBreak="0">
+  <w:abstractNum w:abstractNumId="7" w15:restartNumberingAfterBreak="0">
     <w:nsid w:val="3CD90DEC"/>
     <w:multiLevelType w:val="multilevel"/>
     <w:tmpl w:val="8DC40EC8"/>
@@ -2055,7 +2565,7 @@
       </w:rPr>
     </w:lvl>
   </w:abstractNum>
-  <w:abstractNum w:abstractNumId="4" w15:restartNumberingAfterBreak="0">
+  <w:abstractNum w:abstractNumId="8" w15:restartNumberingAfterBreak="0">
     <w:nsid w:val="3E9D44E3"/>
     <w:multiLevelType w:val="multilevel"/>
     <w:tmpl w:val="F476DDEE"/>
@@ -2168,7 +2678,7 @@
       </w:pPr>
     </w:lvl>
   </w:abstractNum>
-  <w:abstractNum w:abstractNumId="5" w15:restartNumberingAfterBreak="0">
+  <w:abstractNum w:abstractNumId="9" w15:restartNumberingAfterBreak="0">
     <w:nsid w:val="448A3736"/>
     <w:multiLevelType w:val="multilevel"/>
     <w:tmpl w:val="7F0C6A6E"/>
@@ -2317,7 +2827,7 @@
       </w:rPr>
     </w:lvl>
   </w:abstractNum>
-  <w:abstractNum w:abstractNumId="6" w15:restartNumberingAfterBreak="0">
+  <w:abstractNum w:abstractNumId="10" w15:restartNumberingAfterBreak="0">
     <w:nsid w:val="475377F3"/>
     <w:multiLevelType w:val="multilevel"/>
     <w:tmpl w:val="0E0C4350"/>
@@ -2466,7 +2976,7 @@
       </w:rPr>
     </w:lvl>
   </w:abstractNum>
-  <w:abstractNum w:abstractNumId="7" w15:restartNumberingAfterBreak="0">
+  <w:abstractNum w:abstractNumId="11" w15:restartNumberingAfterBreak="0">
     <w:nsid w:val="49307EA2"/>
     <w:multiLevelType w:val="multilevel"/>
     <w:tmpl w:val="AC941F00"/>
@@ -2615,7 +3125,156 @@
       </w:rPr>
     </w:lvl>
   </w:abstractNum>
-  <w:abstractNum w:abstractNumId="8" w15:restartNumberingAfterBreak="0">
+  <w:abstractNum w:abstractNumId="12" w15:restartNumberingAfterBreak="0">
+    <w:nsid w:val="5DAE13C2"/>
+    <w:multiLevelType w:val="multilevel"/>
+    <w:tmpl w:val="4BA8EAE6"/>
+    <w:lvl w:ilvl="0">
+      <w:start w:val="1"/>
+      <w:numFmt w:val="bullet"/>
+      <w:lvlText w:val=""/>
+      <w:lvlJc w:val="left"/>
+      <w:pPr>
+        <w:tabs>
+          <w:tab w:val="num" w:pos="720"/>
+        </w:tabs>
+        <w:ind w:left="720" w:hanging="360"/>
+      </w:pPr>
+      <w:rPr>
+        <w:rFonts w:ascii="Symbol" w:hAnsi="Symbol" w:hint="default"/>
+        <w:sz w:val="20"/>
+      </w:rPr>
+    </w:lvl>
+    <w:lvl w:ilvl="1" w:tentative="1">
+      <w:start w:val="1"/>
+      <w:numFmt w:val="bullet"/>
+      <w:lvlText w:val="o"/>
+      <w:lvlJc w:val="left"/>
+      <w:pPr>
+        <w:tabs>
+          <w:tab w:val="num" w:pos="1440"/>
+        </w:tabs>
+        <w:ind w:left="1440" w:hanging="360"/>
+      </w:pPr>
+      <w:rPr>
+        <w:rFonts w:ascii="Courier New" w:hAnsi="Courier New" w:hint="default"/>
+        <w:sz w:val="20"/>
+      </w:rPr>
+    </w:lvl>
+    <w:lvl w:ilvl="2" w:tentative="1">
+      <w:start w:val="1"/>
+      <w:numFmt w:val="bullet"/>
+      <w:lvlText w:val=""/>
+      <w:lvlJc w:val="left"/>
+      <w:pPr>
+        <w:tabs>
+          <w:tab w:val="num" w:pos="2160"/>
+        </w:tabs>
+        <w:ind w:left="2160" w:hanging="360"/>
+      </w:pPr>
+      <w:rPr>
+        <w:rFonts w:ascii="Wingdings" w:hAnsi="Wingdings" w:hint="default"/>
+        <w:sz w:val="20"/>
+      </w:rPr>
+    </w:lvl>
+    <w:lvl w:ilvl="3" w:tentative="1">
+      <w:start w:val="1"/>
+      <w:numFmt w:val="bullet"/>
+      <w:lvlText w:val=""/>
+      <w:lvlJc w:val="left"/>
+      <w:pPr>
+        <w:tabs>
+          <w:tab w:val="num" w:pos="2880"/>
+        </w:tabs>
+        <w:ind w:left="2880" w:hanging="360"/>
+      </w:pPr>
+      <w:rPr>
+        <w:rFonts w:ascii="Wingdings" w:hAnsi="Wingdings" w:hint="default"/>
+        <w:sz w:val="20"/>
+      </w:rPr>
+    </w:lvl>
+    <w:lvl w:ilvl="4" w:tentative="1">
+      <w:start w:val="1"/>
+      <w:numFmt w:val="bullet"/>
+      <w:lvlText w:val=""/>
+      <w:lvlJc w:val="left"/>
+      <w:pPr>
+        <w:tabs>
+          <w:tab w:val="num" w:pos="3600"/>
+        </w:tabs>
+        <w:ind w:left="3600" w:hanging="360"/>
+      </w:pPr>
+      <w:rPr>
+        <w:rFonts w:ascii="Wingdings" w:hAnsi="Wingdings" w:hint="default"/>
+        <w:sz w:val="20"/>
+      </w:rPr>
+    </w:lvl>
+    <w:lvl w:ilvl="5" w:tentative="1">
+      <w:start w:val="1"/>
+      <w:numFmt w:val="bullet"/>
+      <w:lvlText w:val=""/>
+      <w:lvlJc w:val="left"/>
+      <w:pPr>
+        <w:tabs>
+          <w:tab w:val="num" w:pos="4320"/>
+        </w:tabs>
+        <w:ind w:left="4320" w:hanging="360"/>
+      </w:pPr>
+      <w:rPr>
+        <w:rFonts w:ascii="Wingdings" w:hAnsi="Wingdings" w:hint="default"/>
+        <w:sz w:val="20"/>
+      </w:rPr>
+    </w:lvl>
+    <w:lvl w:ilvl="6" w:tentative="1">
+      <w:start w:val="1"/>
+      <w:numFmt w:val="bullet"/>
+      <w:lvlText w:val=""/>
+      <w:lvlJc w:val="left"/>
+      <w:pPr>
+        <w:tabs>
+          <w:tab w:val="num" w:pos="5040"/>
+        </w:tabs>
+        <w:ind w:left="5040" w:hanging="360"/>
+      </w:pPr>
+      <w:rPr>
+        <w:rFonts w:ascii="Wingdings" w:hAnsi="Wingdings" w:hint="default"/>
+        <w:sz w:val="20"/>
+      </w:rPr>
+    </w:lvl>
+    <w:lvl w:ilvl="7" w:tentative="1">
+      <w:start w:val="1"/>
+      <w:numFmt w:val="bullet"/>
+      <w:lvlText w:val=""/>
+      <w:lvlJc w:val="left"/>
+      <w:pPr>
+        <w:tabs>
+          <w:tab w:val="num" w:pos="5760"/>
+        </w:tabs>
+        <w:ind w:left="5760" w:hanging="360"/>
+      </w:pPr>
+      <w:rPr>
+        <w:rFonts w:ascii="Wingdings" w:hAnsi="Wingdings" w:hint="default"/>
+        <w:sz w:val="20"/>
+      </w:rPr>
+    </w:lvl>
+    <w:lvl w:ilvl="8" w:tentative="1">
+      <w:start w:val="1"/>
+      <w:numFmt w:val="bullet"/>
+      <w:lvlText w:val=""/>
+      <w:lvlJc w:val="left"/>
+      <w:pPr>
+        <w:tabs>
+          <w:tab w:val="num" w:pos="6480"/>
+        </w:tabs>
+        <w:ind w:left="6480" w:hanging="360"/>
+      </w:pPr>
+      <w:rPr>
+        <w:rFonts w:ascii="Wingdings" w:hAnsi="Wingdings" w:hint="default"/>
+        <w:sz w:val="20"/>
+      </w:rPr>
+    </w:lvl>
+  </w:abstractNum>
+  <w:abstractNum w:abstractNumId="13" w15:restartNumberingAfterBreak="0">
     <w:nsid w:val="5E3D0E0D"/>
     <w:multiLevelType w:val="multilevel"/>
     <w:tmpl w:val="9A9CC914"/>
@@ -2764,7 +3423,7 @@
       </w:rPr>
     </w:lvl>
   </w:abstractNum>
-  <w:abstractNum w:abstractNumId="9" w15:restartNumberingAfterBreak="0">
+  <w:abstractNum w:abstractNumId="14" w15:restartNumberingAfterBreak="0">
     <w:nsid w:val="6115226D"/>
     <w:multiLevelType w:val="multilevel"/>
     <w:tmpl w:val="C0CAAA72"/>
@@ -2914,34 +3573,49 @@
     </w:lvl>
   </w:abstractNum>
   <w:num w:numId="1" w16cid:durableId="998729896">
+    <w:abstractNumId w:val="14"/>
+  </w:num>
+  <w:num w:numId="2" w16cid:durableId="696930497">
+    <w:abstractNumId w:val="7"/>
+  </w:num>
+  <w:num w:numId="3" w16cid:durableId="1023441863">
     <w:abstractNumId w:val="9"/>
   </w:num>
-  <w:num w:numId="2" w16cid:durableId="696930497">
+  <w:num w:numId="4" w16cid:durableId="1938437165">
+    <w:abstractNumId w:val="10"/>
+  </w:num>
+  <w:num w:numId="5" w16cid:durableId="1058548650">
+    <w:abstractNumId w:val="13"/>
+  </w:num>
+  <w:num w:numId="6" w16cid:durableId="1497569584">
+    <w:abstractNumId w:val="11"/>
+  </w:num>
+  <w:num w:numId="7" w16cid:durableId="996882647">
+    <w:abstractNumId w:val="1"/>
+  </w:num>
+  <w:num w:numId="8" w16cid:durableId="983847501">
+    <w:abstractNumId w:val="8"/>
+  </w:num>
+  <w:num w:numId="9" w16cid:durableId="1378969271">
+    <w:abstractNumId w:val="2"/>
+  </w:num>
+  <w:num w:numId="10" w16cid:durableId="340543968">
+    <w:abstractNumId w:val="6"/>
+  </w:num>
+  <w:num w:numId="11" w16cid:durableId="788743708">
+    <w:abstractNumId w:val="5"/>
+  </w:num>
+  <w:num w:numId="12" w16cid:durableId="238365628">
+    <w:abstractNumId w:val="12"/>
+  </w:num>
+  <w:num w:numId="13" w16cid:durableId="998776306">
+    <w:abstractNumId w:val="4"/>
+  </w:num>
+  <w:num w:numId="14" w16cid:durableId="1964379166">
     <w:abstractNumId w:val="3"/>
   </w:num>
-  <w:num w:numId="3" w16cid:durableId="1023441863">
-    <w:abstractNumId w:val="5"/>
-  </w:num>
-  <w:num w:numId="4" w16cid:durableId="1938437165">
-    <w:abstractNumId w:val="6"/>
-  </w:num>
-  <w:num w:numId="5" w16cid:durableId="1058548650">
-    <w:abstractNumId w:val="8"/>
-  </w:num>
-  <w:num w:numId="6" w16cid:durableId="1497569584">
-    <w:abstractNumId w:val="7"/>
-  </w:num>
-  <w:num w:numId="7" w16cid:durableId="996882647">
+  <w:num w:numId="15" w16cid:durableId="386613733">
     <w:abstractNumId w:val="0"/>
-  </w:num>
-  <w:num w:numId="8" w16cid:durableId="983847501">
-    <w:abstractNumId w:val="4"/>
-  </w:num>
-  <w:num w:numId="9" w16cid:durableId="1378969271">
-    <w:abstractNumId w:val="1"/>
-  </w:num>
-  <w:num w:numId="10" w16cid:durableId="340543968">
-    <w:abstractNumId w:val="2"/>
   </w:num>
 </w:numbering>
 </file>

</xml_diff>